<commit_message>
feat: add some files in 'BM02' on 'or0017-praca-nova'
</commit_message>
<xml_diff>
--- a/obras-arquivos/or0017-praca-nova-conc042025-geo/praca-nova-geral/medicoes-edicao/BM02/RELATÓRIO FOTOGRÁFICO - BM 02 - PRAÇA NOVA COREMAS.docx
+++ b/obras-arquivos/or0017-praca-nova-conc042025-geo/praca-nova-geral/medicoes-edicao/BM02/RELATÓRIO FOTOGRÁFICO - BM 02 - PRAÇA NOVA COREMAS.docx
@@ -96,6 +96,7 @@
               </w:tabs>
               <w:spacing w:line="360" w:lineRule="auto"/>
               <w:ind w:right="-104"/>
+              <w:jc w:val="center"/>
               <w:rPr>
                 <w:rFonts w:ascii="Times New Roman" w:hAnsi="Times New Roman" w:cs="Times New Roman"/>
                 <w:color w:val="000000" w:themeColor="text1"/>
@@ -118,51 +119,115 @@
                 <w:szCs w:val="20"/>
               </w:rPr>
             </w:pPr>
-          </w:p>
-        </w:tc>
-        <w:tc>
-          <w:tcPr>
-            <w:tcW w:w="4404" w:type="dxa"/>
-          </w:tcPr>
-          <w:p>
-            <w:pPr>
-              <w:tabs>
-                <w:tab w:val="left" w:pos="2450"/>
-                <w:tab w:val="center" w:pos="4252"/>
-              </w:tabs>
-              <w:spacing w:line="360" w:lineRule="auto"/>
+            <w:r>
               <w:rPr>
                 <w:rFonts w:ascii="Times New Roman" w:hAnsi="Times New Roman" w:cs="Times New Roman"/>
                 <w:noProof/>
-                <w:color w:val="000000" w:themeColor="text1"/>
-                <w:sz w:val="24"/>
-                <w:szCs w:val="24"/>
-              </w:rPr>
-            </w:pPr>
-          </w:p>
-          <w:p>
-            <w:pPr>
-              <w:tabs>
-                <w:tab w:val="left" w:pos="2450"/>
-                <w:tab w:val="center" w:pos="4252"/>
-              </w:tabs>
-              <w:rPr>
-                <w:rFonts w:ascii="Times New Roman" w:hAnsi="Times New Roman" w:cs="Times New Roman"/>
-                <w:noProof/>
-                <w:color w:val="000000" w:themeColor="text1"/>
-                <w:sz w:val="24"/>
-                <w:szCs w:val="24"/>
-              </w:rPr>
-            </w:pPr>
-            <w:r>
-              <w:rPr>
-                <w:rFonts w:ascii="Times New Roman" w:hAnsi="Times New Roman" w:cs="Times New Roman"/>
                 <w:color w:val="000000" w:themeColor="text1"/>
                 <w:sz w:val="20"/>
                 <w:szCs w:val="20"/>
               </w:rPr>
-              <w:t xml:space="preserve"> </w:t>
-            </w:r>
+              <w:drawing>
+                <wp:inline distT="0" distB="0" distL="0" distR="0" wp14:anchorId="18CD7D25" wp14:editId="6AE16DAB">
+                  <wp:extent cx="2403041" cy="1668780"/>
+                  <wp:effectExtent l="0" t="0" r="0" b="7620"/>
+                  <wp:docPr id="1" name="Imagem 1"/>
+                  <wp:cNvGraphicFramePr>
+                    <a:graphicFrameLocks xmlns:a="http://schemas.openxmlformats.org/drawingml/2006/main" noChangeAspect="1"/>
+                  </wp:cNvGraphicFramePr>
+                  <a:graphic xmlns:a="http://schemas.openxmlformats.org/drawingml/2006/main">
+                    <a:graphicData uri="http://schemas.openxmlformats.org/drawingml/2006/picture">
+                      <pic:pic xmlns:pic="http://schemas.openxmlformats.org/drawingml/2006/picture">
+                        <pic:nvPicPr>
+                          <pic:cNvPr id="0" name="Picture 1"/>
+                          <pic:cNvPicPr>
+                            <a:picLocks noChangeAspect="1" noChangeArrowheads="1"/>
+                          </pic:cNvPicPr>
+                        </pic:nvPicPr>
+                        <pic:blipFill>
+                          <a:blip r:embed="rId7" cstate="print">
+                            <a:extLst>
+                              <a:ext uri="{28A0092B-C50C-407E-A947-70E740481C1C}">
+                                <a14:useLocalDpi xmlns:a14="http://schemas.microsoft.com/office/drawing/2010/main" val="0"/>
+                              </a:ext>
+                            </a:extLst>
+                          </a:blip>
+                          <a:srcRect/>
+                          <a:stretch>
+                            <a:fillRect/>
+                          </a:stretch>
+                        </pic:blipFill>
+                        <pic:spPr bwMode="auto">
+                          <a:xfrm>
+                            <a:off x="0" y="0"/>
+                            <a:ext cx="2453459" cy="1703793"/>
+                          </a:xfrm>
+                          <a:prstGeom prst="rect">
+                            <a:avLst/>
+                          </a:prstGeom>
+                          <a:noFill/>
+                          <a:ln>
+                            <a:noFill/>
+                          </a:ln>
+                        </pic:spPr>
+                      </pic:pic>
+                    </a:graphicData>
+                  </a:graphic>
+                </wp:inline>
+              </w:drawing>
+            </w:r>
+          </w:p>
+          <w:p>
+            <w:pPr>
+              <w:tabs>
+                <w:tab w:val="left" w:pos="2450"/>
+                <w:tab w:val="center" w:pos="4252"/>
+              </w:tabs>
+              <w:jc w:val="center"/>
+              <w:rPr>
+                <w:rFonts w:ascii="Times New Roman" w:hAnsi="Times New Roman" w:cs="Times New Roman"/>
+                <w:color w:val="000000" w:themeColor="text1"/>
+                <w:sz w:val="20"/>
+                <w:szCs w:val="20"/>
+              </w:rPr>
+            </w:pPr>
+          </w:p>
+          <w:p>
+            <w:pPr>
+              <w:tabs>
+                <w:tab w:val="left" w:pos="2450"/>
+                <w:tab w:val="center" w:pos="4252"/>
+              </w:tabs>
+              <w:jc w:val="center"/>
+              <w:rPr>
+                <w:rFonts w:ascii="Times New Roman" w:hAnsi="Times New Roman" w:cs="Times New Roman"/>
+                <w:color w:val="000000" w:themeColor="text1"/>
+                <w:sz w:val="20"/>
+                <w:szCs w:val="20"/>
+              </w:rPr>
+            </w:pPr>
+          </w:p>
+        </w:tc>
+        <w:tc>
+          <w:tcPr>
+            <w:tcW w:w="4404" w:type="dxa"/>
+          </w:tcPr>
+          <w:p>
+            <w:pPr>
+              <w:tabs>
+                <w:tab w:val="left" w:pos="2450"/>
+                <w:tab w:val="center" w:pos="4252"/>
+              </w:tabs>
+              <w:spacing w:line="276" w:lineRule="auto"/>
+              <w:jc w:val="center"/>
+              <w:rPr>
+                <w:rFonts w:ascii="Times New Roman" w:hAnsi="Times New Roman" w:cs="Times New Roman"/>
+                <w:noProof/>
+                <w:color w:val="000000" w:themeColor="text1"/>
+                <w:sz w:val="24"/>
+                <w:szCs w:val="24"/>
+              </w:rPr>
+            </w:pPr>
           </w:p>
           <w:p>
             <w:pPr>
@@ -180,6 +245,63 @@
                 <w:szCs w:val="24"/>
               </w:rPr>
             </w:pPr>
+            <w:r>
+              <w:rPr>
+                <w:rFonts w:ascii="Times New Roman" w:hAnsi="Times New Roman" w:cs="Times New Roman"/>
+                <w:noProof/>
+                <w:color w:val="000000" w:themeColor="text1"/>
+                <w:sz w:val="24"/>
+                <w:szCs w:val="24"/>
+              </w:rPr>
+              <w:drawing>
+                <wp:inline distT="0" distB="0" distL="0" distR="0" wp14:anchorId="2984CC26" wp14:editId="5F5FFC82">
+                  <wp:extent cx="2437000" cy="1668780"/>
+                  <wp:effectExtent l="0" t="0" r="1905" b="7620"/>
+                  <wp:docPr id="3" name="Imagem 3"/>
+                  <wp:cNvGraphicFramePr>
+                    <a:graphicFrameLocks xmlns:a="http://schemas.openxmlformats.org/drawingml/2006/main" noChangeAspect="1"/>
+                  </wp:cNvGraphicFramePr>
+                  <a:graphic xmlns:a="http://schemas.openxmlformats.org/drawingml/2006/main">
+                    <a:graphicData uri="http://schemas.openxmlformats.org/drawingml/2006/picture">
+                      <pic:pic xmlns:pic="http://schemas.openxmlformats.org/drawingml/2006/picture">
+                        <pic:nvPicPr>
+                          <pic:cNvPr id="0" name="Picture 2"/>
+                          <pic:cNvPicPr>
+                            <a:picLocks noChangeAspect="1" noChangeArrowheads="1"/>
+                          </pic:cNvPicPr>
+                        </pic:nvPicPr>
+                        <pic:blipFill>
+                          <a:blip r:embed="rId8" cstate="print">
+                            <a:extLst>
+                              <a:ext uri="{28A0092B-C50C-407E-A947-70E740481C1C}">
+                                <a14:useLocalDpi xmlns:a14="http://schemas.microsoft.com/office/drawing/2010/main" val="0"/>
+                              </a:ext>
+                            </a:extLst>
+                          </a:blip>
+                          <a:srcRect/>
+                          <a:stretch>
+                            <a:fillRect/>
+                          </a:stretch>
+                        </pic:blipFill>
+                        <pic:spPr bwMode="auto">
+                          <a:xfrm>
+                            <a:off x="0" y="0"/>
+                            <a:ext cx="2447787" cy="1676167"/>
+                          </a:xfrm>
+                          <a:prstGeom prst="rect">
+                            <a:avLst/>
+                          </a:prstGeom>
+                          <a:noFill/>
+                          <a:ln>
+                            <a:noFill/>
+                          </a:ln>
+                        </pic:spPr>
+                      </pic:pic>
+                    </a:graphicData>
+                  </a:graphic>
+                </wp:inline>
+              </w:drawing>
+            </w:r>
           </w:p>
         </w:tc>
       </w:tr>
@@ -215,16 +337,7 @@
                 <w:sz w:val="16"/>
                 <w:szCs w:val="16"/>
               </w:rPr>
-              <w:t>Placa de Obra</w:t>
-            </w:r>
-            <w:r>
-              <w:rPr>
-                <w:rFonts w:ascii="Times New Roman" w:hAnsi="Times New Roman" w:cs="Times New Roman"/>
-                <w:color w:val="000000" w:themeColor="text1"/>
-                <w:sz w:val="16"/>
-                <w:szCs w:val="16"/>
-              </w:rPr>
-              <w:t xml:space="preserve"> </w:t>
+              <w:t xml:space="preserve">Execução da Alvenaria e do Chapisco (Muro) </w:t>
             </w:r>
           </w:p>
         </w:tc>
@@ -252,11 +365,32 @@
             <w:r>
               <w:rPr>
                 <w:rFonts w:ascii="Times New Roman" w:hAnsi="Times New Roman" w:cs="Times New Roman"/>
-                <w:color w:val="000000" w:themeColor="text1"/>
-                <w:sz w:val="16"/>
-                <w:szCs w:val="16"/>
-              </w:rPr>
-              <w:t>Limpeza do terreno</w:t>
+                <w:noProof/>
+                <w:color w:val="000000" w:themeColor="text1"/>
+                <w:sz w:val="16"/>
+                <w:szCs w:val="16"/>
+              </w:rPr>
+              <w:t xml:space="preserve">Execução das Vigas Superiores do Muro </w:t>
+            </w:r>
+            <w:r>
+              <w:rPr>
+                <w:rFonts w:ascii="Times New Roman" w:hAnsi="Times New Roman" w:cs="Times New Roman"/>
+                <w:noProof/>
+                <w:color w:val="000000" w:themeColor="text1"/>
+                <w:sz w:val="16"/>
+                <w:szCs w:val="16"/>
+              </w:rPr>
+              <w:t>Lateral</w:t>
+            </w:r>
+            <w:r>
+              <w:rPr>
+                <w:rFonts w:ascii="Times New Roman" w:hAnsi="Times New Roman" w:cs="Times New Roman"/>
+                <w:noProof/>
+                <w:color w:val="000000" w:themeColor="text1"/>
+                <w:sz w:val="16"/>
+                <w:szCs w:val="16"/>
+              </w:rPr>
+              <w:t xml:space="preserve"> (Muro)</w:t>
             </w:r>
           </w:p>
         </w:tc>
@@ -370,8 +504,9 @@
                 <w:tab w:val="left" w:pos="2450"/>
                 <w:tab w:val="center" w:pos="4283"/>
               </w:tabs>
-              <w:spacing w:line="360" w:lineRule="auto"/>
+              <w:spacing w:line="276" w:lineRule="auto"/>
               <w:ind w:right="-134"/>
+              <w:jc w:val="distribute"/>
               <w:rPr>
                 <w:rFonts w:ascii="Times New Roman" w:hAnsi="Times New Roman" w:cs="Times New Roman"/>
                 <w:noProof/>
@@ -389,6 +524,7 @@
               </w:tabs>
               <w:spacing w:line="360" w:lineRule="auto"/>
               <w:ind w:right="-134"/>
+              <w:jc w:val="center"/>
               <w:rPr>
                 <w:rFonts w:ascii="Times New Roman" w:hAnsi="Times New Roman" w:cs="Times New Roman"/>
                 <w:noProof/>
@@ -397,6 +533,73 @@
                 <w:szCs w:val="24"/>
               </w:rPr>
             </w:pPr>
+            <w:r>
+              <w:rPr>
+                <w:rFonts w:ascii="Times New Roman" w:hAnsi="Times New Roman" w:cs="Times New Roman"/>
+                <w:noProof/>
+                <w:color w:val="000000" w:themeColor="text1"/>
+                <w:sz w:val="24"/>
+                <w:szCs w:val="24"/>
+              </w:rPr>
+              <w:drawing>
+                <wp:inline distT="0" distB="0" distL="0" distR="0" wp14:anchorId="75D6BE98" wp14:editId="20AFEB13">
+                  <wp:extent cx="2315845" cy="1746521"/>
+                  <wp:effectExtent l="0" t="0" r="8255" b="6350"/>
+                  <wp:docPr id="6" name="Imagem 6"/>
+                  <wp:cNvGraphicFramePr>
+                    <a:graphicFrameLocks xmlns:a="http://schemas.openxmlformats.org/drawingml/2006/main" noChangeAspect="1"/>
+                  </wp:cNvGraphicFramePr>
+                  <a:graphic xmlns:a="http://schemas.openxmlformats.org/drawingml/2006/main">
+                    <a:graphicData uri="http://schemas.openxmlformats.org/drawingml/2006/picture">
+                      <pic:pic xmlns:pic="http://schemas.openxmlformats.org/drawingml/2006/picture">
+                        <pic:nvPicPr>
+                          <pic:cNvPr id="6" name="Imagem 6"/>
+                          <pic:cNvPicPr/>
+                        </pic:nvPicPr>
+                        <pic:blipFill>
+                          <a:blip r:embed="rId9" cstate="print">
+                            <a:extLst>
+                              <a:ext uri="{28A0092B-C50C-407E-A947-70E740481C1C}">
+                                <a14:useLocalDpi xmlns:a14="http://schemas.microsoft.com/office/drawing/2010/main" val="0"/>
+                              </a:ext>
+                            </a:extLst>
+                          </a:blip>
+                          <a:stretch>
+                            <a:fillRect/>
+                          </a:stretch>
+                        </pic:blipFill>
+                        <pic:spPr>
+                          <a:xfrm>
+                            <a:off x="0" y="0"/>
+                            <a:ext cx="2340828" cy="1765362"/>
+                          </a:xfrm>
+                          <a:prstGeom prst="rect">
+                            <a:avLst/>
+                          </a:prstGeom>
+                        </pic:spPr>
+                      </pic:pic>
+                    </a:graphicData>
+                  </a:graphic>
+                </wp:inline>
+              </w:drawing>
+            </w:r>
+          </w:p>
+          <w:p>
+            <w:pPr>
+              <w:tabs>
+                <w:tab w:val="left" w:pos="2450"/>
+                <w:tab w:val="center" w:pos="4283"/>
+              </w:tabs>
+              <w:ind w:right="-134"/>
+              <w:jc w:val="center"/>
+              <w:rPr>
+                <w:rFonts w:ascii="Times New Roman" w:hAnsi="Times New Roman" w:cs="Times New Roman"/>
+                <w:noProof/>
+                <w:color w:val="000000" w:themeColor="text1"/>
+                <w:sz w:val="24"/>
+                <w:szCs w:val="24"/>
+              </w:rPr>
+            </w:pPr>
           </w:p>
         </w:tc>
         <w:tc>
@@ -409,29 +612,80 @@
                 <w:tab w:val="left" w:pos="2450"/>
                 <w:tab w:val="center" w:pos="4252"/>
               </w:tabs>
-              <w:spacing w:line="360" w:lineRule="auto"/>
-              <w:rPr>
-                <w:rFonts w:ascii="Times New Roman" w:hAnsi="Times New Roman" w:cs="Times New Roman"/>
-                <w:color w:val="000000" w:themeColor="text1"/>
-                <w:sz w:val="24"/>
-                <w:szCs w:val="24"/>
-              </w:rPr>
-            </w:pPr>
-          </w:p>
-          <w:p>
-            <w:pPr>
-              <w:tabs>
-                <w:tab w:val="left" w:pos="2450"/>
-                <w:tab w:val="center" w:pos="4252"/>
-              </w:tabs>
-              <w:spacing w:line="360" w:lineRule="auto"/>
-              <w:rPr>
-                <w:rFonts w:ascii="Times New Roman" w:hAnsi="Times New Roman" w:cs="Times New Roman"/>
-                <w:color w:val="000000" w:themeColor="text1"/>
-                <w:sz w:val="24"/>
-                <w:szCs w:val="24"/>
-              </w:rPr>
-            </w:pPr>
+              <w:spacing w:line="276" w:lineRule="auto"/>
+              <w:rPr>
+                <w:rFonts w:ascii="Times New Roman" w:hAnsi="Times New Roman" w:cs="Times New Roman"/>
+                <w:color w:val="000000" w:themeColor="text1"/>
+                <w:sz w:val="24"/>
+                <w:szCs w:val="24"/>
+              </w:rPr>
+            </w:pPr>
+          </w:p>
+          <w:p>
+            <w:pPr>
+              <w:tabs>
+                <w:tab w:val="left" w:pos="2450"/>
+                <w:tab w:val="center" w:pos="4252"/>
+              </w:tabs>
+              <w:spacing w:line="360" w:lineRule="auto"/>
+              <w:jc w:val="center"/>
+              <w:rPr>
+                <w:rFonts w:ascii="Times New Roman" w:hAnsi="Times New Roman" w:cs="Times New Roman"/>
+                <w:color w:val="000000" w:themeColor="text1"/>
+                <w:sz w:val="24"/>
+                <w:szCs w:val="24"/>
+              </w:rPr>
+            </w:pPr>
+            <w:r>
+              <w:rPr>
+                <w:rFonts w:ascii="Times New Roman" w:hAnsi="Times New Roman" w:cs="Times New Roman"/>
+                <w:noProof/>
+                <w:color w:val="000000" w:themeColor="text1"/>
+                <w:sz w:val="24"/>
+                <w:szCs w:val="24"/>
+              </w:rPr>
+              <w:drawing>
+                <wp:inline distT="0" distB="0" distL="0" distR="0" wp14:anchorId="50E61E2C" wp14:editId="5001F605">
+                  <wp:extent cx="2288239" cy="1733270"/>
+                  <wp:effectExtent l="0" t="0" r="0" b="635"/>
+                  <wp:docPr id="7" name="Imagem 7"/>
+                  <wp:cNvGraphicFramePr>
+                    <a:graphicFrameLocks xmlns:a="http://schemas.openxmlformats.org/drawingml/2006/main" noChangeAspect="1"/>
+                  </wp:cNvGraphicFramePr>
+                  <a:graphic xmlns:a="http://schemas.openxmlformats.org/drawingml/2006/main">
+                    <a:graphicData uri="http://schemas.openxmlformats.org/drawingml/2006/picture">
+                      <pic:pic xmlns:pic="http://schemas.openxmlformats.org/drawingml/2006/picture">
+                        <pic:nvPicPr>
+                          <pic:cNvPr id="7" name="Imagem 7"/>
+                          <pic:cNvPicPr/>
+                        </pic:nvPicPr>
+                        <pic:blipFill>
+                          <a:blip r:embed="rId10" cstate="print">
+                            <a:extLst>
+                              <a:ext uri="{28A0092B-C50C-407E-A947-70E740481C1C}">
+                                <a14:useLocalDpi xmlns:a14="http://schemas.microsoft.com/office/drawing/2010/main" val="0"/>
+                              </a:ext>
+                            </a:extLst>
+                          </a:blip>
+                          <a:stretch>
+                            <a:fillRect/>
+                          </a:stretch>
+                        </pic:blipFill>
+                        <pic:spPr>
+                          <a:xfrm>
+                            <a:off x="0" y="0"/>
+                            <a:ext cx="2307555" cy="1747901"/>
+                          </a:xfrm>
+                          <a:prstGeom prst="rect">
+                            <a:avLst/>
+                          </a:prstGeom>
+                        </pic:spPr>
+                      </pic:pic>
+                    </a:graphicData>
+                  </a:graphic>
+                </wp:inline>
+              </w:drawing>
+            </w:r>
           </w:p>
         </w:tc>
       </w:tr>
@@ -467,27 +721,7 @@
                 <w:sz w:val="16"/>
                 <w:szCs w:val="16"/>
               </w:rPr>
-              <w:t>Escavação de Vala</w:t>
-            </w:r>
-            <w:r>
-              <w:rPr>
-                <w:rFonts w:ascii="Times New Roman" w:hAnsi="Times New Roman" w:cs="Times New Roman"/>
-                <w:noProof/>
-                <w:color w:val="000000" w:themeColor="text1"/>
-                <w:sz w:val="16"/>
-                <w:szCs w:val="16"/>
-              </w:rPr>
-              <w:t xml:space="preserve"> </w:t>
-            </w:r>
-            <w:r>
-              <w:rPr>
-                <w:rFonts w:ascii="Times New Roman" w:hAnsi="Times New Roman" w:cs="Times New Roman"/>
-                <w:noProof/>
-                <w:color w:val="000000" w:themeColor="text1"/>
-                <w:sz w:val="16"/>
-                <w:szCs w:val="16"/>
-              </w:rPr>
-              <w:t>(Muro)</w:t>
+              <w:t>Execução das Vigas Superiores do Muro de Fundo (Muro)</w:t>
             </w:r>
           </w:p>
         </w:tc>
@@ -517,16 +751,16 @@
                 <w:sz w:val="16"/>
                 <w:szCs w:val="16"/>
               </w:rPr>
-              <w:t>Execução da Sapata, Pilar de Arranque e da Alvenaria de Regularização</w:t>
-            </w:r>
-            <w:r>
-              <w:rPr>
-                <w:rFonts w:ascii="Times New Roman" w:hAnsi="Times New Roman" w:cs="Times New Roman"/>
-                <w:color w:val="000000" w:themeColor="text1"/>
-                <w:sz w:val="16"/>
-                <w:szCs w:val="16"/>
-              </w:rPr>
-              <w:t xml:space="preserve"> </w:t>
+              <w:t>Execução d</w:t>
+            </w:r>
+            <w:r>
+              <w:rPr>
+                <w:rFonts w:ascii="Times New Roman" w:hAnsi="Times New Roman" w:cs="Times New Roman"/>
+                <w:color w:val="000000" w:themeColor="text1"/>
+                <w:sz w:val="16"/>
+                <w:szCs w:val="16"/>
+              </w:rPr>
+              <w:t xml:space="preserve">o Emboço e Chapim de Concreto do Muro Lateral </w:t>
             </w:r>
             <w:r>
               <w:rPr>
@@ -703,7 +937,6 @@
                 <w:tab w:val="left" w:pos="2450"/>
                 <w:tab w:val="center" w:pos="4252"/>
               </w:tabs>
-              <w:spacing w:line="360" w:lineRule="auto"/>
               <w:rPr>
                 <w:rFonts w:ascii="Times New Roman" w:hAnsi="Times New Roman" w:cs="Times New Roman"/>
                 <w:noProof/>
@@ -727,6 +960,56 @@
                 <w:szCs w:val="24"/>
               </w:rPr>
             </w:pPr>
+            <w:r>
+              <w:rPr>
+                <w:rFonts w:ascii="Times New Roman" w:hAnsi="Times New Roman" w:cs="Times New Roman"/>
+                <w:noProof/>
+                <w:color w:val="000000" w:themeColor="text1"/>
+                <w:sz w:val="24"/>
+                <w:szCs w:val="24"/>
+              </w:rPr>
+              <w:drawing>
+                <wp:inline distT="0" distB="0" distL="0" distR="0" wp14:anchorId="25F23224" wp14:editId="4D3F019B">
+                  <wp:extent cx="2401025" cy="1798320"/>
+                  <wp:effectExtent l="0" t="0" r="0" b="0"/>
+                  <wp:docPr id="8" name="Imagem 8"/>
+                  <wp:cNvGraphicFramePr>
+                    <a:graphicFrameLocks xmlns:a="http://schemas.openxmlformats.org/drawingml/2006/main" noChangeAspect="1"/>
+                  </wp:cNvGraphicFramePr>
+                  <a:graphic xmlns:a="http://schemas.openxmlformats.org/drawingml/2006/main">
+                    <a:graphicData uri="http://schemas.openxmlformats.org/drawingml/2006/picture">
+                      <pic:pic xmlns:pic="http://schemas.openxmlformats.org/drawingml/2006/picture">
+                        <pic:nvPicPr>
+                          <pic:cNvPr id="8" name="Imagem 8"/>
+                          <pic:cNvPicPr/>
+                        </pic:nvPicPr>
+                        <pic:blipFill>
+                          <a:blip r:embed="rId11" cstate="print">
+                            <a:extLst>
+                              <a:ext uri="{28A0092B-C50C-407E-A947-70E740481C1C}">
+                                <a14:useLocalDpi xmlns:a14="http://schemas.microsoft.com/office/drawing/2010/main" val="0"/>
+                              </a:ext>
+                            </a:extLst>
+                          </a:blip>
+                          <a:stretch>
+                            <a:fillRect/>
+                          </a:stretch>
+                        </pic:blipFill>
+                        <pic:spPr>
+                          <a:xfrm>
+                            <a:off x="0" y="0"/>
+                            <a:ext cx="2412589" cy="1806982"/>
+                          </a:xfrm>
+                          <a:prstGeom prst="rect">
+                            <a:avLst/>
+                          </a:prstGeom>
+                        </pic:spPr>
+                      </pic:pic>
+                    </a:graphicData>
+                  </a:graphic>
+                </wp:inline>
+              </w:drawing>
+            </w:r>
           </w:p>
         </w:tc>
         <w:tc>
@@ -739,7 +1022,6 @@
                 <w:tab w:val="left" w:pos="2450"/>
                 <w:tab w:val="center" w:pos="4252"/>
               </w:tabs>
-              <w:spacing w:line="360" w:lineRule="auto"/>
               <w:jc w:val="center"/>
               <w:rPr>
                 <w:rFonts w:ascii="Times New Roman" w:hAnsi="Times New Roman" w:cs="Times New Roman"/>
@@ -757,6 +1039,71 @@
                 <w:tab w:val="center" w:pos="4252"/>
               </w:tabs>
               <w:spacing w:line="360" w:lineRule="auto"/>
+              <w:jc w:val="center"/>
+              <w:rPr>
+                <w:rFonts w:ascii="Times New Roman" w:hAnsi="Times New Roman" w:cs="Times New Roman"/>
+                <w:color w:val="000000" w:themeColor="text1"/>
+                <w:sz w:val="24"/>
+                <w:szCs w:val="24"/>
+              </w:rPr>
+            </w:pPr>
+            <w:r>
+              <w:rPr>
+                <w:rFonts w:ascii="Times New Roman" w:hAnsi="Times New Roman" w:cs="Times New Roman"/>
+                <w:noProof/>
+                <w:color w:val="000000" w:themeColor="text1"/>
+                <w:sz w:val="24"/>
+                <w:szCs w:val="24"/>
+              </w:rPr>
+              <w:drawing>
+                <wp:inline distT="0" distB="0" distL="0" distR="0" wp14:anchorId="11A7ED20" wp14:editId="235B8DF2">
+                  <wp:extent cx="2427834" cy="1806623"/>
+                  <wp:effectExtent l="0" t="0" r="0" b="3175"/>
+                  <wp:docPr id="25" name="Imagem 25"/>
+                  <wp:cNvGraphicFramePr>
+                    <a:graphicFrameLocks xmlns:a="http://schemas.openxmlformats.org/drawingml/2006/main" noChangeAspect="1"/>
+                  </wp:cNvGraphicFramePr>
+                  <a:graphic xmlns:a="http://schemas.openxmlformats.org/drawingml/2006/main">
+                    <a:graphicData uri="http://schemas.openxmlformats.org/drawingml/2006/picture">
+                      <pic:pic xmlns:pic="http://schemas.openxmlformats.org/drawingml/2006/picture">
+                        <pic:nvPicPr>
+                          <pic:cNvPr id="25" name="Imagem 25"/>
+                          <pic:cNvPicPr/>
+                        </pic:nvPicPr>
+                        <pic:blipFill>
+                          <a:blip r:embed="rId12">
+                            <a:extLst>
+                              <a:ext uri="{28A0092B-C50C-407E-A947-70E740481C1C}">
+                                <a14:useLocalDpi xmlns:a14="http://schemas.microsoft.com/office/drawing/2010/main" val="0"/>
+                              </a:ext>
+                            </a:extLst>
+                          </a:blip>
+                          <a:stretch>
+                            <a:fillRect/>
+                          </a:stretch>
+                        </pic:blipFill>
+                        <pic:spPr>
+                          <a:xfrm>
+                            <a:off x="0" y="0"/>
+                            <a:ext cx="2440259" cy="1815869"/>
+                          </a:xfrm>
+                          <a:prstGeom prst="rect">
+                            <a:avLst/>
+                          </a:prstGeom>
+                        </pic:spPr>
+                      </pic:pic>
+                    </a:graphicData>
+                  </a:graphic>
+                </wp:inline>
+              </w:drawing>
+            </w:r>
+          </w:p>
+          <w:p>
+            <w:pPr>
+              <w:tabs>
+                <w:tab w:val="left" w:pos="2450"/>
+                <w:tab w:val="center" w:pos="4252"/>
+              </w:tabs>
               <w:jc w:val="center"/>
               <w:rPr>
                 <w:rFonts w:ascii="Times New Roman" w:hAnsi="Times New Roman" w:cs="Times New Roman"/>
@@ -798,7 +1145,25 @@
                 <w:sz w:val="16"/>
                 <w:szCs w:val="16"/>
               </w:rPr>
-              <w:t>Execução da Viga Baldrame (Muro)</w:t>
+              <w:t>Execução d</w:t>
+            </w:r>
+            <w:r>
+              <w:rPr>
+                <w:rFonts w:ascii="Times New Roman" w:hAnsi="Times New Roman" w:cs="Times New Roman"/>
+                <w:color w:val="000000" w:themeColor="text1"/>
+                <w:sz w:val="16"/>
+                <w:szCs w:val="16"/>
+              </w:rPr>
+              <w:t xml:space="preserve">os Pilares e Emboço do Muro de Fundo </w:t>
+            </w:r>
+            <w:r>
+              <w:rPr>
+                <w:rFonts w:ascii="Times New Roman" w:hAnsi="Times New Roman" w:cs="Times New Roman"/>
+                <w:color w:val="000000" w:themeColor="text1"/>
+                <w:sz w:val="16"/>
+                <w:szCs w:val="16"/>
+              </w:rPr>
+              <w:t>(Muro)</w:t>
             </w:r>
           </w:p>
         </w:tc>
@@ -828,7 +1193,16 @@
                 <w:sz w:val="16"/>
                 <w:szCs w:val="16"/>
               </w:rPr>
-              <w:t>Impermeabilização da Viga Baldrame (Muro)</w:t>
+              <w:t>Execução do Fechamento em Madeira</w:t>
+            </w:r>
+            <w:r>
+              <w:rPr>
+                <w:rFonts w:ascii="Times New Roman" w:hAnsi="Times New Roman" w:cs="Times New Roman"/>
+                <w:color w:val="000000" w:themeColor="text1"/>
+                <w:sz w:val="16"/>
+                <w:szCs w:val="16"/>
+              </w:rPr>
+              <w:t xml:space="preserve"> (Muro)</w:t>
             </w:r>
           </w:p>
         </w:tc>
@@ -959,7 +1333,6 @@
                 <w:tab w:val="left" w:pos="2450"/>
                 <w:tab w:val="center" w:pos="4252"/>
               </w:tabs>
-              <w:spacing w:line="360" w:lineRule="auto"/>
               <w:jc w:val="center"/>
               <w:rPr>
                 <w:rFonts w:ascii="Times New Roman" w:hAnsi="Times New Roman" w:cs="Times New Roman"/>
@@ -986,14 +1359,63 @@
                 <w:szCs w:val="24"/>
               </w:rPr>
             </w:pPr>
-          </w:p>
-          <w:p>
-            <w:pPr>
-              <w:tabs>
-                <w:tab w:val="left" w:pos="2450"/>
-                <w:tab w:val="center" w:pos="4252"/>
-              </w:tabs>
-              <w:spacing w:line="360" w:lineRule="auto"/>
+            <w:r>
+              <w:rPr>
+                <w:rFonts w:ascii="Times New Roman" w:hAnsi="Times New Roman" w:cs="Times New Roman"/>
+                <w:noProof/>
+                <w:color w:val="000000" w:themeColor="text1"/>
+                <w:sz w:val="24"/>
+                <w:szCs w:val="24"/>
+              </w:rPr>
+              <w:drawing>
+                <wp:inline distT="0" distB="0" distL="0" distR="0" wp14:anchorId="2E01C6FF" wp14:editId="7596EA97">
+                  <wp:extent cx="2450465" cy="1836701"/>
+                  <wp:effectExtent l="0" t="0" r="6985" b="0"/>
+                  <wp:docPr id="5" name="Imagem 5"/>
+                  <wp:cNvGraphicFramePr>
+                    <a:graphicFrameLocks xmlns:a="http://schemas.openxmlformats.org/drawingml/2006/main" noChangeAspect="1"/>
+                  </wp:cNvGraphicFramePr>
+                  <a:graphic xmlns:a="http://schemas.openxmlformats.org/drawingml/2006/main">
+                    <a:graphicData uri="http://schemas.openxmlformats.org/drawingml/2006/picture">
+                      <pic:pic xmlns:pic="http://schemas.openxmlformats.org/drawingml/2006/picture">
+                        <pic:nvPicPr>
+                          <pic:cNvPr id="5" name="Imagem 5"/>
+                          <pic:cNvPicPr/>
+                        </pic:nvPicPr>
+                        <pic:blipFill>
+                          <a:blip r:embed="rId13" cstate="print">
+                            <a:extLst>
+                              <a:ext uri="{28A0092B-C50C-407E-A947-70E740481C1C}">
+                                <a14:useLocalDpi xmlns:a14="http://schemas.microsoft.com/office/drawing/2010/main" val="0"/>
+                              </a:ext>
+                            </a:extLst>
+                          </a:blip>
+                          <a:stretch>
+                            <a:fillRect/>
+                          </a:stretch>
+                        </pic:blipFill>
+                        <pic:spPr>
+                          <a:xfrm>
+                            <a:off x="0" y="0"/>
+                            <a:ext cx="2460941" cy="1844553"/>
+                          </a:xfrm>
+                          <a:prstGeom prst="rect">
+                            <a:avLst/>
+                          </a:prstGeom>
+                        </pic:spPr>
+                      </pic:pic>
+                    </a:graphicData>
+                  </a:graphic>
+                </wp:inline>
+              </w:drawing>
+            </w:r>
+          </w:p>
+          <w:p>
+            <w:pPr>
+              <w:tabs>
+                <w:tab w:val="left" w:pos="2450"/>
+                <w:tab w:val="center" w:pos="4252"/>
+              </w:tabs>
               <w:rPr>
                 <w:rFonts w:ascii="Times New Roman" w:hAnsi="Times New Roman" w:cs="Times New Roman"/>
                 <w:color w:val="000000" w:themeColor="text1"/>
@@ -1013,29 +1435,79 @@
                 <w:tab w:val="left" w:pos="2450"/>
                 <w:tab w:val="center" w:pos="4252"/>
               </w:tabs>
-              <w:spacing w:line="360" w:lineRule="auto"/>
-              <w:rPr>
-                <w:rFonts w:ascii="Times New Roman" w:hAnsi="Times New Roman" w:cs="Times New Roman"/>
-                <w:color w:val="000000" w:themeColor="text1"/>
-                <w:sz w:val="24"/>
-                <w:szCs w:val="24"/>
-              </w:rPr>
-            </w:pPr>
-          </w:p>
-          <w:p>
-            <w:pPr>
-              <w:tabs>
-                <w:tab w:val="left" w:pos="2450"/>
-                <w:tab w:val="center" w:pos="4252"/>
-              </w:tabs>
-              <w:spacing w:line="360" w:lineRule="auto"/>
-              <w:rPr>
-                <w:rFonts w:ascii="Times New Roman" w:hAnsi="Times New Roman" w:cs="Times New Roman"/>
-                <w:color w:val="000000" w:themeColor="text1"/>
-                <w:sz w:val="24"/>
-                <w:szCs w:val="24"/>
-              </w:rPr>
-            </w:pPr>
+              <w:rPr>
+                <w:rFonts w:ascii="Times New Roman" w:hAnsi="Times New Roman" w:cs="Times New Roman"/>
+                <w:color w:val="000000" w:themeColor="text1"/>
+                <w:sz w:val="24"/>
+                <w:szCs w:val="24"/>
+              </w:rPr>
+            </w:pPr>
+          </w:p>
+          <w:p>
+            <w:pPr>
+              <w:tabs>
+                <w:tab w:val="left" w:pos="2450"/>
+                <w:tab w:val="center" w:pos="4252"/>
+              </w:tabs>
+              <w:spacing w:line="360" w:lineRule="auto"/>
+              <w:jc w:val="center"/>
+              <w:rPr>
+                <w:rFonts w:ascii="Times New Roman" w:hAnsi="Times New Roman" w:cs="Times New Roman"/>
+                <w:color w:val="000000" w:themeColor="text1"/>
+                <w:sz w:val="24"/>
+                <w:szCs w:val="24"/>
+              </w:rPr>
+            </w:pPr>
+            <w:r>
+              <w:rPr>
+                <w:rFonts w:ascii="Times New Roman" w:hAnsi="Times New Roman" w:cs="Times New Roman"/>
+                <w:noProof/>
+                <w:color w:val="000000" w:themeColor="text1"/>
+                <w:sz w:val="24"/>
+                <w:szCs w:val="24"/>
+              </w:rPr>
+              <w:drawing>
+                <wp:inline distT="0" distB="0" distL="0" distR="0" wp14:anchorId="307DBB6D" wp14:editId="70FF5743">
+                  <wp:extent cx="2492375" cy="1870038"/>
+                  <wp:effectExtent l="0" t="0" r="3175" b="0"/>
+                  <wp:docPr id="10" name="Imagem 10"/>
+                  <wp:cNvGraphicFramePr>
+                    <a:graphicFrameLocks xmlns:a="http://schemas.openxmlformats.org/drawingml/2006/main" noChangeAspect="1"/>
+                  </wp:cNvGraphicFramePr>
+                  <a:graphic xmlns:a="http://schemas.openxmlformats.org/drawingml/2006/main">
+                    <a:graphicData uri="http://schemas.openxmlformats.org/drawingml/2006/picture">
+                      <pic:pic xmlns:pic="http://schemas.openxmlformats.org/drawingml/2006/picture">
+                        <pic:nvPicPr>
+                          <pic:cNvPr id="10" name="Imagem 10"/>
+                          <pic:cNvPicPr/>
+                        </pic:nvPicPr>
+                        <pic:blipFill>
+                          <a:blip r:embed="rId14" cstate="print">
+                            <a:extLst>
+                              <a:ext uri="{28A0092B-C50C-407E-A947-70E740481C1C}">
+                                <a14:useLocalDpi xmlns:a14="http://schemas.microsoft.com/office/drawing/2010/main" val="0"/>
+                              </a:ext>
+                            </a:extLst>
+                          </a:blip>
+                          <a:stretch>
+                            <a:fillRect/>
+                          </a:stretch>
+                        </pic:blipFill>
+                        <pic:spPr>
+                          <a:xfrm>
+                            <a:off x="0" y="0"/>
+                            <a:ext cx="2512449" cy="1885100"/>
+                          </a:xfrm>
+                          <a:prstGeom prst="rect">
+                            <a:avLst/>
+                          </a:prstGeom>
+                        </pic:spPr>
+                      </pic:pic>
+                    </a:graphicData>
+                  </a:graphic>
+                </wp:inline>
+              </w:drawing>
+            </w:r>
           </w:p>
         </w:tc>
       </w:tr>
@@ -1069,25 +1541,45 @@
                 <w:sz w:val="16"/>
                 <w:szCs w:val="16"/>
               </w:rPr>
-              <w:t>Execução da Alvenaria de Regularização, Vigas Baldrames, Armação</w:t>
-            </w:r>
-            <w:r>
-              <w:rPr>
-                <w:rFonts w:ascii="Times New Roman" w:hAnsi="Times New Roman" w:cs="Times New Roman"/>
-                <w:color w:val="000000" w:themeColor="text1"/>
-                <w:sz w:val="16"/>
-                <w:szCs w:val="16"/>
-              </w:rPr>
-              <w:t xml:space="preserve"> de Arranque</w:t>
-            </w:r>
-            <w:r>
-              <w:rPr>
-                <w:rFonts w:ascii="Times New Roman" w:hAnsi="Times New Roman" w:cs="Times New Roman"/>
-                <w:color w:val="000000" w:themeColor="text1"/>
-                <w:sz w:val="16"/>
-                <w:szCs w:val="16"/>
-              </w:rPr>
-              <w:t xml:space="preserve"> dos Pilares (Quiosque)</w:t>
+              <w:t>Execução d</w:t>
+            </w:r>
+            <w:r>
+              <w:rPr>
+                <w:rFonts w:ascii="Times New Roman" w:hAnsi="Times New Roman" w:cs="Times New Roman"/>
+                <w:color w:val="000000" w:themeColor="text1"/>
+                <w:sz w:val="16"/>
+                <w:szCs w:val="16"/>
+              </w:rPr>
+              <w:t xml:space="preserve">os Pilares (Internos e Externos), Vigas, Alvenaria de Vedação e Vegas e </w:t>
+            </w:r>
+            <w:proofErr w:type="spellStart"/>
+            <w:r>
+              <w:rPr>
+                <w:rFonts w:ascii="Times New Roman" w:hAnsi="Times New Roman" w:cs="Times New Roman"/>
+                <w:color w:val="000000" w:themeColor="text1"/>
+                <w:sz w:val="16"/>
+                <w:szCs w:val="16"/>
+              </w:rPr>
+              <w:t>Contravergas</w:t>
+            </w:r>
+            <w:proofErr w:type="spellEnd"/>
+            <w:r>
+              <w:rPr>
+                <w:rFonts w:ascii="Times New Roman" w:hAnsi="Times New Roman" w:cs="Times New Roman"/>
+                <w:color w:val="000000" w:themeColor="text1"/>
+                <w:sz w:val="16"/>
+                <w:szCs w:val="16"/>
+              </w:rPr>
+              <w:t xml:space="preserve"> </w:t>
+            </w:r>
+            <w:r>
+              <w:rPr>
+                <w:rFonts w:ascii="Times New Roman" w:hAnsi="Times New Roman" w:cs="Times New Roman"/>
+                <w:color w:val="000000" w:themeColor="text1"/>
+                <w:sz w:val="16"/>
+                <w:szCs w:val="16"/>
+              </w:rPr>
+              <w:t>(Quiosque)</w:t>
             </w:r>
           </w:p>
         </w:tc>
@@ -1117,46 +1609,21 @@
                 <w:sz w:val="16"/>
                 <w:szCs w:val="16"/>
               </w:rPr>
-              <w:t>Impermeabilização das Vigas Baldrames (Quiosque)</w:t>
+              <w:t>Execução do Contrapiso</w:t>
+            </w:r>
+            <w:r>
+              <w:rPr>
+                <w:rFonts w:ascii="Times New Roman" w:hAnsi="Times New Roman" w:cs="Times New Roman"/>
+                <w:color w:val="000000" w:themeColor="text1"/>
+                <w:sz w:val="16"/>
+                <w:szCs w:val="16"/>
+              </w:rPr>
+              <w:t xml:space="preserve"> (Quiosque)</w:t>
             </w:r>
           </w:p>
         </w:tc>
       </w:tr>
     </w:tbl>
-    <w:p>
-      <w:pPr>
-        <w:shd w:val="clear" w:color="auto" w:fill="FFFFFF" w:themeFill="background1"/>
-        <w:tabs>
-          <w:tab w:val="left" w:pos="2450"/>
-          <w:tab w:val="center" w:pos="4252"/>
-        </w:tabs>
-        <w:spacing w:line="360" w:lineRule="auto"/>
-        <w:ind w:right="480"/>
-        <w:rPr>
-          <w:rFonts w:ascii="Times New Roman" w:hAnsi="Times New Roman" w:cs="Times New Roman"/>
-          <w:color w:val="000000" w:themeColor="text1"/>
-          <w:sz w:val="24"/>
-          <w:szCs w:val="24"/>
-        </w:rPr>
-      </w:pPr>
-    </w:p>
-    <w:p>
-      <w:pPr>
-        <w:shd w:val="clear" w:color="auto" w:fill="FFFFFF" w:themeFill="background1"/>
-        <w:tabs>
-          <w:tab w:val="left" w:pos="2450"/>
-          <w:tab w:val="center" w:pos="4252"/>
-        </w:tabs>
-        <w:spacing w:line="360" w:lineRule="auto"/>
-        <w:ind w:right="480"/>
-        <w:rPr>
-          <w:rFonts w:ascii="Times New Roman" w:hAnsi="Times New Roman" w:cs="Times New Roman"/>
-          <w:color w:val="000000" w:themeColor="text1"/>
-          <w:sz w:val="24"/>
-          <w:szCs w:val="24"/>
-        </w:rPr>
-      </w:pPr>
-    </w:p>
     <w:p>
       <w:pPr>
         <w:shd w:val="clear" w:color="auto" w:fill="FFFFFF" w:themeFill="background1"/>
@@ -1199,8 +1666,8 @@
         <w:tblLook w:val="04A0" w:firstRow="1" w:lastRow="0" w:firstColumn="1" w:lastColumn="0" w:noHBand="0" w:noVBand="1"/>
       </w:tblPr>
       <w:tblGrid>
-        <w:gridCol w:w="4106"/>
-        <w:gridCol w:w="4547"/>
+        <w:gridCol w:w="4390"/>
+        <w:gridCol w:w="4263"/>
       </w:tblGrid>
       <w:tr>
         <w:trPr>
@@ -1208,7 +1675,7 @@
         </w:trPr>
         <w:tc>
           <w:tcPr>
-            <w:tcW w:w="4106" w:type="dxa"/>
+            <w:tcW w:w="4390" w:type="dxa"/>
           </w:tcPr>
           <w:p>
             <w:pPr>
@@ -1233,13 +1700,14 @@
                 <w:sz w:val="24"/>
                 <w:szCs w:val="24"/>
               </w:rPr>
+              <w:lastRenderedPageBreak/>
               <w:t>FOTO 09</w:t>
             </w:r>
           </w:p>
         </w:tc>
         <w:tc>
           <w:tcPr>
-            <w:tcW w:w="4547" w:type="dxa"/>
+            <w:tcW w:w="4263" w:type="dxa"/>
           </w:tcPr>
           <w:p>
             <w:pPr>
@@ -1275,15 +1743,14 @@
         </w:trPr>
         <w:tc>
           <w:tcPr>
-            <w:tcW w:w="4106" w:type="dxa"/>
-          </w:tcPr>
-          <w:p>
-            <w:pPr>
-              <w:tabs>
-                <w:tab w:val="left" w:pos="2450"/>
-                <w:tab w:val="center" w:pos="4252"/>
-              </w:tabs>
-              <w:spacing w:line="360" w:lineRule="auto"/>
+            <w:tcW w:w="4390" w:type="dxa"/>
+          </w:tcPr>
+          <w:p>
+            <w:pPr>
+              <w:tabs>
+                <w:tab w:val="left" w:pos="2450"/>
+                <w:tab w:val="center" w:pos="4252"/>
+              </w:tabs>
               <w:rPr>
                 <w:rFonts w:ascii="Times New Roman" w:hAnsi="Times New Roman" w:cs="Times New Roman"/>
                 <w:noProof/>
@@ -1308,20 +1775,7 @@
                 <w:szCs w:val="24"/>
               </w:rPr>
             </w:pPr>
-          </w:p>
-        </w:tc>
-        <w:tc>
-          <w:tcPr>
-            <w:tcW w:w="4547" w:type="dxa"/>
-          </w:tcPr>
-          <w:p>
-            <w:pPr>
-              <w:tabs>
-                <w:tab w:val="left" w:pos="2450"/>
-                <w:tab w:val="center" w:pos="4252"/>
-              </w:tabs>
-              <w:spacing w:line="360" w:lineRule="auto"/>
-              <w:jc w:val="center"/>
+            <w:r>
               <w:rPr>
                 <w:rFonts w:ascii="Times New Roman" w:hAnsi="Times New Roman" w:cs="Times New Roman"/>
                 <w:noProof/>
@@ -1329,23 +1783,150 @@
                 <w:sz w:val="24"/>
                 <w:szCs w:val="24"/>
               </w:rPr>
-            </w:pPr>
-          </w:p>
-          <w:p>
-            <w:pPr>
-              <w:tabs>
-                <w:tab w:val="left" w:pos="2450"/>
-                <w:tab w:val="center" w:pos="4252"/>
-              </w:tabs>
-              <w:spacing w:line="360" w:lineRule="auto"/>
-              <w:jc w:val="center"/>
-              <w:rPr>
-                <w:rFonts w:ascii="Times New Roman" w:hAnsi="Times New Roman" w:cs="Times New Roman"/>
-                <w:color w:val="000000" w:themeColor="text1"/>
-                <w:sz w:val="24"/>
-                <w:szCs w:val="24"/>
-              </w:rPr>
-            </w:pPr>
+              <w:drawing>
+                <wp:inline distT="0" distB="0" distL="0" distR="0" wp14:anchorId="4C6741EA" wp14:editId="122FA18B">
+                  <wp:extent cx="2339294" cy="1752600"/>
+                  <wp:effectExtent l="0" t="0" r="4445" b="0"/>
+                  <wp:docPr id="11" name="Imagem 11"/>
+                  <wp:cNvGraphicFramePr>
+                    <a:graphicFrameLocks xmlns:a="http://schemas.openxmlformats.org/drawingml/2006/main" noChangeAspect="1"/>
+                  </wp:cNvGraphicFramePr>
+                  <a:graphic xmlns:a="http://schemas.openxmlformats.org/drawingml/2006/main">
+                    <a:graphicData uri="http://schemas.openxmlformats.org/drawingml/2006/picture">
+                      <pic:pic xmlns:pic="http://schemas.openxmlformats.org/drawingml/2006/picture">
+                        <pic:nvPicPr>
+                          <pic:cNvPr id="11" name="Imagem 11"/>
+                          <pic:cNvPicPr/>
+                        </pic:nvPicPr>
+                        <pic:blipFill>
+                          <a:blip r:embed="rId15" cstate="print">
+                            <a:extLst>
+                              <a:ext uri="{28A0092B-C50C-407E-A947-70E740481C1C}">
+                                <a14:useLocalDpi xmlns:a14="http://schemas.microsoft.com/office/drawing/2010/main" val="0"/>
+                              </a:ext>
+                            </a:extLst>
+                          </a:blip>
+                          <a:stretch>
+                            <a:fillRect/>
+                          </a:stretch>
+                        </pic:blipFill>
+                        <pic:spPr>
+                          <a:xfrm>
+                            <a:off x="0" y="0"/>
+                            <a:ext cx="2393271" cy="1793039"/>
+                          </a:xfrm>
+                          <a:prstGeom prst="rect">
+                            <a:avLst/>
+                          </a:prstGeom>
+                        </pic:spPr>
+                      </pic:pic>
+                    </a:graphicData>
+                  </a:graphic>
+                </wp:inline>
+              </w:drawing>
+            </w:r>
+          </w:p>
+          <w:p>
+            <w:pPr>
+              <w:tabs>
+                <w:tab w:val="left" w:pos="2450"/>
+                <w:tab w:val="center" w:pos="4252"/>
+              </w:tabs>
+              <w:jc w:val="center"/>
+              <w:rPr>
+                <w:rFonts w:ascii="Times New Roman" w:hAnsi="Times New Roman" w:cs="Times New Roman"/>
+                <w:color w:val="000000" w:themeColor="text1"/>
+                <w:sz w:val="24"/>
+                <w:szCs w:val="24"/>
+              </w:rPr>
+            </w:pPr>
+          </w:p>
+        </w:tc>
+        <w:tc>
+          <w:tcPr>
+            <w:tcW w:w="4263" w:type="dxa"/>
+          </w:tcPr>
+          <w:p>
+            <w:pPr>
+              <w:tabs>
+                <w:tab w:val="left" w:pos="2450"/>
+                <w:tab w:val="center" w:pos="4252"/>
+              </w:tabs>
+              <w:jc w:val="center"/>
+              <w:rPr>
+                <w:rFonts w:ascii="Times New Roman" w:hAnsi="Times New Roman" w:cs="Times New Roman"/>
+                <w:noProof/>
+                <w:color w:val="000000" w:themeColor="text1"/>
+                <w:sz w:val="24"/>
+                <w:szCs w:val="24"/>
+              </w:rPr>
+            </w:pPr>
+          </w:p>
+          <w:p>
+            <w:pPr>
+              <w:tabs>
+                <w:tab w:val="left" w:pos="2450"/>
+                <w:tab w:val="center" w:pos="4252"/>
+              </w:tabs>
+              <w:spacing w:line="360" w:lineRule="auto"/>
+              <w:jc w:val="center"/>
+              <w:rPr>
+                <w:rFonts w:ascii="Times New Roman" w:hAnsi="Times New Roman" w:cs="Times New Roman"/>
+                <w:color w:val="000000" w:themeColor="text1"/>
+                <w:sz w:val="24"/>
+                <w:szCs w:val="24"/>
+              </w:rPr>
+            </w:pPr>
+            <w:r>
+              <w:rPr>
+                <w:rFonts w:ascii="Times New Roman" w:hAnsi="Times New Roman" w:cs="Times New Roman"/>
+                <w:noProof/>
+                <w:color w:val="000000" w:themeColor="text1"/>
+                <w:sz w:val="24"/>
+                <w:szCs w:val="24"/>
+              </w:rPr>
+              <w:drawing>
+                <wp:inline distT="0" distB="0" distL="0" distR="0" wp14:anchorId="29C8815A" wp14:editId="6862EEBC">
+                  <wp:extent cx="2298109" cy="1724025"/>
+                  <wp:effectExtent l="0" t="0" r="6985" b="0"/>
+                  <wp:docPr id="12" name="Imagem 12"/>
+                  <wp:cNvGraphicFramePr>
+                    <a:graphicFrameLocks xmlns:a="http://schemas.openxmlformats.org/drawingml/2006/main" noChangeAspect="1"/>
+                  </wp:cNvGraphicFramePr>
+                  <a:graphic xmlns:a="http://schemas.openxmlformats.org/drawingml/2006/main">
+                    <a:graphicData uri="http://schemas.openxmlformats.org/drawingml/2006/picture">
+                      <pic:pic xmlns:pic="http://schemas.openxmlformats.org/drawingml/2006/picture">
+                        <pic:nvPicPr>
+                          <pic:cNvPr id="12" name="Imagem 12"/>
+                          <pic:cNvPicPr/>
+                        </pic:nvPicPr>
+                        <pic:blipFill>
+                          <a:blip r:embed="rId16" cstate="print">
+                            <a:extLst>
+                              <a:ext uri="{28A0092B-C50C-407E-A947-70E740481C1C}">
+                                <a14:useLocalDpi xmlns:a14="http://schemas.microsoft.com/office/drawing/2010/main" val="0"/>
+                              </a:ext>
+                            </a:extLst>
+                          </a:blip>
+                          <a:stretch>
+                            <a:fillRect/>
+                          </a:stretch>
+                        </pic:blipFill>
+                        <pic:spPr>
+                          <a:xfrm>
+                            <a:off x="0" y="0"/>
+                            <a:ext cx="2315006" cy="1736701"/>
+                          </a:xfrm>
+                          <a:prstGeom prst="rect">
+                            <a:avLst/>
+                          </a:prstGeom>
+                        </pic:spPr>
+                      </pic:pic>
+                    </a:graphicData>
+                  </a:graphic>
+                </wp:inline>
+              </w:drawing>
+            </w:r>
           </w:p>
         </w:tc>
       </w:tr>
@@ -1355,7 +1936,7 @@
         </w:trPr>
         <w:tc>
           <w:tcPr>
-            <w:tcW w:w="4106" w:type="dxa"/>
+            <w:tcW w:w="4390" w:type="dxa"/>
           </w:tcPr>
           <w:p>
             <w:pPr>
@@ -1388,25 +1969,16 @@
                 <w:sz w:val="16"/>
                 <w:szCs w:val="16"/>
               </w:rPr>
-              <w:t>Execução das Sapatas, Alvenaria de Regularização e Armação dos Pilares da Cobertura</w:t>
-            </w:r>
-            <w:r>
-              <w:rPr>
-                <w:rFonts w:ascii="Times New Roman" w:hAnsi="Times New Roman" w:cs="Times New Roman"/>
-                <w:color w:val="000000" w:themeColor="text1"/>
-                <w:sz w:val="16"/>
-                <w:szCs w:val="16"/>
-              </w:rPr>
-              <w:t xml:space="preserve"> Externa</w:t>
-            </w:r>
-            <w:r>
-              <w:rPr>
-                <w:rFonts w:ascii="Times New Roman" w:hAnsi="Times New Roman" w:cs="Times New Roman"/>
-                <w:color w:val="000000" w:themeColor="text1"/>
-                <w:sz w:val="16"/>
-                <w:szCs w:val="16"/>
-              </w:rPr>
-              <w:t xml:space="preserve"> </w:t>
+              <w:t xml:space="preserve">Execução </w:t>
+            </w:r>
+            <w:r>
+              <w:rPr>
+                <w:rFonts w:ascii="Times New Roman" w:hAnsi="Times New Roman" w:cs="Times New Roman"/>
+                <w:color w:val="000000" w:themeColor="text1"/>
+                <w:sz w:val="16"/>
+                <w:szCs w:val="16"/>
+              </w:rPr>
+              <w:t xml:space="preserve">das Instalações Hidráulicas </w:t>
             </w:r>
             <w:r>
               <w:rPr>
@@ -1421,40 +1993,49 @@
         </w:tc>
         <w:tc>
           <w:tcPr>
-            <w:tcW w:w="4547" w:type="dxa"/>
-          </w:tcPr>
-          <w:p>
-            <w:pPr>
-              <w:tabs>
-                <w:tab w:val="left" w:pos="2450"/>
-                <w:tab w:val="center" w:pos="4252"/>
-              </w:tabs>
-              <w:spacing w:line="360" w:lineRule="auto"/>
-              <w:jc w:val="center"/>
-              <w:rPr>
-                <w:rFonts w:ascii="Times New Roman" w:hAnsi="Times New Roman" w:cs="Times New Roman"/>
-                <w:color w:val="000000" w:themeColor="text1"/>
-                <w:sz w:val="16"/>
-                <w:szCs w:val="16"/>
-              </w:rPr>
-            </w:pPr>
-            <w:r>
-              <w:rPr>
-                <w:rFonts w:ascii="Times New Roman" w:hAnsi="Times New Roman" w:cs="Times New Roman"/>
-                <w:color w:val="000000" w:themeColor="text1"/>
-                <w:sz w:val="16"/>
-                <w:szCs w:val="16"/>
-              </w:rPr>
-              <w:t xml:space="preserve">Montagem das Formas dos Pilares </w:t>
-            </w:r>
-            <w:r>
-              <w:rPr>
-                <w:rFonts w:ascii="Times New Roman" w:hAnsi="Times New Roman" w:cs="Times New Roman"/>
-                <w:color w:val="000000" w:themeColor="text1"/>
-                <w:sz w:val="16"/>
-                <w:szCs w:val="16"/>
-              </w:rPr>
-              <w:t>(Quiosque)</w:t>
+            <w:tcW w:w="4263" w:type="dxa"/>
+          </w:tcPr>
+          <w:p>
+            <w:pPr>
+              <w:tabs>
+                <w:tab w:val="left" w:pos="2450"/>
+                <w:tab w:val="center" w:pos="4252"/>
+              </w:tabs>
+              <w:spacing w:line="360" w:lineRule="auto"/>
+              <w:jc w:val="center"/>
+              <w:rPr>
+                <w:rFonts w:ascii="Times New Roman" w:hAnsi="Times New Roman" w:cs="Times New Roman"/>
+                <w:color w:val="000000" w:themeColor="text1"/>
+                <w:sz w:val="16"/>
+                <w:szCs w:val="16"/>
+              </w:rPr>
+            </w:pPr>
+            <w:r>
+              <w:rPr>
+                <w:rFonts w:ascii="Times New Roman" w:hAnsi="Times New Roman" w:cs="Times New Roman"/>
+                <w:color w:val="000000" w:themeColor="text1"/>
+                <w:sz w:val="16"/>
+                <w:szCs w:val="16"/>
+              </w:rPr>
+              <w:t xml:space="preserve">Execução das Instalações </w:t>
+            </w:r>
+            <w:r>
+              <w:rPr>
+                <w:rFonts w:ascii="Times New Roman" w:hAnsi="Times New Roman" w:cs="Times New Roman"/>
+                <w:color w:val="000000" w:themeColor="text1"/>
+                <w:sz w:val="16"/>
+                <w:szCs w:val="16"/>
+              </w:rPr>
+              <w:t>Elétricas</w:t>
+            </w:r>
+            <w:r>
+              <w:rPr>
+                <w:rFonts w:ascii="Times New Roman" w:hAnsi="Times New Roman" w:cs="Times New Roman"/>
+                <w:color w:val="000000" w:themeColor="text1"/>
+                <w:sz w:val="16"/>
+                <w:szCs w:val="16"/>
+              </w:rPr>
+              <w:t xml:space="preserve"> (Quiosque)</w:t>
             </w:r>
           </w:p>
         </w:tc>
@@ -1567,7 +2148,6 @@
                 <w:tab w:val="left" w:pos="2450"/>
                 <w:tab w:val="center" w:pos="4252"/>
               </w:tabs>
-              <w:spacing w:line="360" w:lineRule="auto"/>
               <w:jc w:val="center"/>
               <w:rPr>
                 <w:rFonts w:ascii="Times New Roman" w:hAnsi="Times New Roman" w:cs="Times New Roman"/>
@@ -1594,14 +2174,64 @@
                 <w:szCs w:val="24"/>
               </w:rPr>
             </w:pPr>
-          </w:p>
-          <w:p>
-            <w:pPr>
-              <w:tabs>
-                <w:tab w:val="left" w:pos="2450"/>
-                <w:tab w:val="center" w:pos="4252"/>
-              </w:tabs>
-              <w:spacing w:line="360" w:lineRule="auto"/>
+            <w:r>
+              <w:rPr>
+                <w:rFonts w:ascii="Times New Roman" w:hAnsi="Times New Roman" w:cs="Times New Roman"/>
+                <w:noProof/>
+                <w:color w:val="000000" w:themeColor="text1"/>
+                <w:sz w:val="24"/>
+                <w:szCs w:val="24"/>
+              </w:rPr>
+              <w:drawing>
+                <wp:inline distT="0" distB="0" distL="0" distR="0" wp14:anchorId="63B70683" wp14:editId="5B3F04F4">
+                  <wp:extent cx="2468245" cy="1851659"/>
+                  <wp:effectExtent l="0" t="0" r="8255" b="0"/>
+                  <wp:docPr id="13" name="Imagem 13"/>
+                  <wp:cNvGraphicFramePr>
+                    <a:graphicFrameLocks xmlns:a="http://schemas.openxmlformats.org/drawingml/2006/main" noChangeAspect="1"/>
+                  </wp:cNvGraphicFramePr>
+                  <a:graphic xmlns:a="http://schemas.openxmlformats.org/drawingml/2006/main">
+                    <a:graphicData uri="http://schemas.openxmlformats.org/drawingml/2006/picture">
+                      <pic:pic xmlns:pic="http://schemas.openxmlformats.org/drawingml/2006/picture">
+                        <pic:nvPicPr>
+                          <pic:cNvPr id="13" name="Imagem 13"/>
+                          <pic:cNvPicPr/>
+                        </pic:nvPicPr>
+                        <pic:blipFill>
+                          <a:blip r:embed="rId17" cstate="print">
+                            <a:extLst>
+                              <a:ext uri="{28A0092B-C50C-407E-A947-70E740481C1C}">
+                                <a14:useLocalDpi xmlns:a14="http://schemas.microsoft.com/office/drawing/2010/main" val="0"/>
+                              </a:ext>
+                            </a:extLst>
+                          </a:blip>
+                          <a:stretch>
+                            <a:fillRect/>
+                          </a:stretch>
+                        </pic:blipFill>
+                        <pic:spPr>
+                          <a:xfrm>
+                            <a:off x="0" y="0"/>
+                            <a:ext cx="2497361" cy="1873501"/>
+                          </a:xfrm>
+                          <a:prstGeom prst="rect">
+                            <a:avLst/>
+                          </a:prstGeom>
+                        </pic:spPr>
+                      </pic:pic>
+                    </a:graphicData>
+                  </a:graphic>
+                </wp:inline>
+              </w:drawing>
+            </w:r>
+          </w:p>
+          <w:p>
+            <w:pPr>
+              <w:tabs>
+                <w:tab w:val="left" w:pos="2450"/>
+                <w:tab w:val="center" w:pos="4252"/>
+              </w:tabs>
+              <w:jc w:val="distribute"/>
               <w:rPr>
                 <w:rFonts w:ascii="Times New Roman" w:hAnsi="Times New Roman" w:cs="Times New Roman"/>
                 <w:color w:val="000000" w:themeColor="text1"/>
@@ -1621,22 +2251,86 @@
                 <w:tab w:val="left" w:pos="2450"/>
                 <w:tab w:val="center" w:pos="4252"/>
               </w:tabs>
-              <w:spacing w:line="360" w:lineRule="auto"/>
-              <w:rPr>
-                <w:rFonts w:ascii="Times New Roman" w:hAnsi="Times New Roman" w:cs="Times New Roman"/>
-                <w:color w:val="000000" w:themeColor="text1"/>
-                <w:sz w:val="24"/>
-                <w:szCs w:val="24"/>
-              </w:rPr>
-            </w:pPr>
-          </w:p>
-          <w:p>
-            <w:pPr>
-              <w:tabs>
-                <w:tab w:val="left" w:pos="2450"/>
-                <w:tab w:val="center" w:pos="4252"/>
-              </w:tabs>
-              <w:spacing w:line="360" w:lineRule="auto"/>
+              <w:rPr>
+                <w:rFonts w:ascii="Times New Roman" w:hAnsi="Times New Roman" w:cs="Times New Roman"/>
+                <w:color w:val="000000" w:themeColor="text1"/>
+                <w:sz w:val="24"/>
+                <w:szCs w:val="24"/>
+              </w:rPr>
+            </w:pPr>
+          </w:p>
+          <w:p>
+            <w:pPr>
+              <w:tabs>
+                <w:tab w:val="left" w:pos="2450"/>
+                <w:tab w:val="center" w:pos="4252"/>
+              </w:tabs>
+              <w:spacing w:line="360" w:lineRule="auto"/>
+              <w:jc w:val="center"/>
+              <w:rPr>
+                <w:rFonts w:ascii="Times New Roman" w:hAnsi="Times New Roman" w:cs="Times New Roman"/>
+                <w:color w:val="000000" w:themeColor="text1"/>
+                <w:sz w:val="24"/>
+                <w:szCs w:val="24"/>
+              </w:rPr>
+            </w:pPr>
+            <w:r>
+              <w:rPr>
+                <w:rFonts w:ascii="Times New Roman" w:hAnsi="Times New Roman" w:cs="Times New Roman"/>
+                <w:noProof/>
+                <w:color w:val="000000" w:themeColor="text1"/>
+                <w:sz w:val="24"/>
+                <w:szCs w:val="24"/>
+              </w:rPr>
+              <w:drawing>
+                <wp:inline distT="0" distB="0" distL="0" distR="0" wp14:anchorId="4A29BCCE" wp14:editId="5E9763AE">
+                  <wp:extent cx="2433182" cy="1825625"/>
+                  <wp:effectExtent l="0" t="0" r="5715" b="3175"/>
+                  <wp:docPr id="14" name="Imagem 14"/>
+                  <wp:cNvGraphicFramePr>
+                    <a:graphicFrameLocks xmlns:a="http://schemas.openxmlformats.org/drawingml/2006/main" noChangeAspect="1"/>
+                  </wp:cNvGraphicFramePr>
+                  <a:graphic xmlns:a="http://schemas.openxmlformats.org/drawingml/2006/main">
+                    <a:graphicData uri="http://schemas.openxmlformats.org/drawingml/2006/picture">
+                      <pic:pic xmlns:pic="http://schemas.openxmlformats.org/drawingml/2006/picture">
+                        <pic:nvPicPr>
+                          <pic:cNvPr id="14" name="Imagem 14"/>
+                          <pic:cNvPicPr/>
+                        </pic:nvPicPr>
+                        <pic:blipFill>
+                          <a:blip r:embed="rId18" cstate="print">
+                            <a:extLst>
+                              <a:ext uri="{28A0092B-C50C-407E-A947-70E740481C1C}">
+                                <a14:useLocalDpi xmlns:a14="http://schemas.microsoft.com/office/drawing/2010/main" val="0"/>
+                              </a:ext>
+                            </a:extLst>
+                          </a:blip>
+                          <a:stretch>
+                            <a:fillRect/>
+                          </a:stretch>
+                        </pic:blipFill>
+                        <pic:spPr>
+                          <a:xfrm>
+                            <a:off x="0" y="0"/>
+                            <a:ext cx="2463687" cy="1848513"/>
+                          </a:xfrm>
+                          <a:prstGeom prst="rect">
+                            <a:avLst/>
+                          </a:prstGeom>
+                        </pic:spPr>
+                      </pic:pic>
+                    </a:graphicData>
+                  </a:graphic>
+                </wp:inline>
+              </w:drawing>
+            </w:r>
+          </w:p>
+          <w:p>
+            <w:pPr>
+              <w:tabs>
+                <w:tab w:val="left" w:pos="2450"/>
+                <w:tab w:val="center" w:pos="4252"/>
+              </w:tabs>
               <w:jc w:val="center"/>
               <w:rPr>
                 <w:rFonts w:ascii="Times New Roman" w:hAnsi="Times New Roman" w:cs="Times New Roman"/>
@@ -1678,7 +2372,25 @@
                 <w:sz w:val="16"/>
                 <w:szCs w:val="16"/>
               </w:rPr>
-              <w:t>Escavação de Vala, Execução da Fundação com Alvenaria de Regularização e Armação dos Pilares (Guarita)</w:t>
+              <w:t xml:space="preserve">Execução das Instalações </w:t>
+            </w:r>
+            <w:r>
+              <w:rPr>
+                <w:rFonts w:ascii="Times New Roman" w:hAnsi="Times New Roman" w:cs="Times New Roman"/>
+                <w:color w:val="000000" w:themeColor="text1"/>
+                <w:sz w:val="16"/>
+                <w:szCs w:val="16"/>
+              </w:rPr>
+              <w:t>Sanitárias</w:t>
+            </w:r>
+            <w:r>
+              <w:rPr>
+                <w:rFonts w:ascii="Times New Roman" w:hAnsi="Times New Roman" w:cs="Times New Roman"/>
+                <w:color w:val="000000" w:themeColor="text1"/>
+                <w:sz w:val="16"/>
+                <w:szCs w:val="16"/>
+              </w:rPr>
+              <w:t xml:space="preserve"> (Quiosque)</w:t>
             </w:r>
           </w:p>
         </w:tc>
@@ -1708,16 +2420,7 @@
                 <w:sz w:val="16"/>
                 <w:szCs w:val="16"/>
               </w:rPr>
-              <w:t>Execução das Vigas Baldrames (Guarita</w:t>
-            </w:r>
-            <w:r>
-              <w:rPr>
-                <w:rFonts w:ascii="Times New Roman" w:hAnsi="Times New Roman" w:cs="Times New Roman"/>
-                <w:color w:val="000000" w:themeColor="text1"/>
-                <w:sz w:val="16"/>
-                <w:szCs w:val="16"/>
-              </w:rPr>
-              <w:t>)</w:t>
+              <w:t>Execução das Instalações Sanitárias (Quiosque)</w:t>
             </w:r>
           </w:p>
         </w:tc>
@@ -1815,6 +2518,7 @@
                 <w:sz w:val="24"/>
                 <w:szCs w:val="24"/>
               </w:rPr>
+              <w:lastRenderedPageBreak/>
               <w:t>FOTO 1</w:t>
             </w:r>
             <w:r>
@@ -1882,7 +2586,6 @@
                 <w:tab w:val="left" w:pos="2450"/>
                 <w:tab w:val="center" w:pos="4252"/>
               </w:tabs>
-              <w:spacing w:line="360" w:lineRule="auto"/>
               <w:rPr>
                 <w:rFonts w:ascii="Times New Roman" w:hAnsi="Times New Roman" w:cs="Times New Roman"/>
                 <w:noProof/>
@@ -1898,7 +2601,72 @@
                 <w:tab w:val="left" w:pos="2450"/>
                 <w:tab w:val="center" w:pos="4252"/>
               </w:tabs>
-              <w:spacing w:line="360" w:lineRule="auto"/>
+              <w:jc w:val="center"/>
+              <w:rPr>
+                <w:rFonts w:ascii="Times New Roman" w:hAnsi="Times New Roman" w:cs="Times New Roman"/>
+                <w:color w:val="000000" w:themeColor="text1"/>
+                <w:sz w:val="24"/>
+                <w:szCs w:val="24"/>
+              </w:rPr>
+            </w:pPr>
+            <w:r>
+              <w:rPr>
+                <w:rFonts w:ascii="Times New Roman" w:hAnsi="Times New Roman" w:cs="Times New Roman"/>
+                <w:noProof/>
+                <w:color w:val="000000" w:themeColor="text1"/>
+                <w:sz w:val="24"/>
+                <w:szCs w:val="24"/>
+              </w:rPr>
+              <w:drawing>
+                <wp:inline distT="0" distB="0" distL="0" distR="0" wp14:anchorId="621B48E6" wp14:editId="3AA31252">
+                  <wp:extent cx="2186166" cy="1640046"/>
+                  <wp:effectExtent l="0" t="0" r="5080" b="0"/>
+                  <wp:docPr id="16" name="Imagem 16"/>
+                  <wp:cNvGraphicFramePr>
+                    <a:graphicFrameLocks xmlns:a="http://schemas.openxmlformats.org/drawingml/2006/main" noChangeAspect="1"/>
+                  </wp:cNvGraphicFramePr>
+                  <a:graphic xmlns:a="http://schemas.openxmlformats.org/drawingml/2006/main">
+                    <a:graphicData uri="http://schemas.openxmlformats.org/drawingml/2006/picture">
+                      <pic:pic xmlns:pic="http://schemas.openxmlformats.org/drawingml/2006/picture">
+                        <pic:nvPicPr>
+                          <pic:cNvPr id="16" name="Imagem 16"/>
+                          <pic:cNvPicPr/>
+                        </pic:nvPicPr>
+                        <pic:blipFill>
+                          <a:blip r:embed="rId19" cstate="print">
+                            <a:extLst>
+                              <a:ext uri="{28A0092B-C50C-407E-A947-70E740481C1C}">
+                                <a14:useLocalDpi xmlns:a14="http://schemas.microsoft.com/office/drawing/2010/main" val="0"/>
+                              </a:ext>
+                            </a:extLst>
+                          </a:blip>
+                          <a:stretch>
+                            <a:fillRect/>
+                          </a:stretch>
+                        </pic:blipFill>
+                        <pic:spPr>
+                          <a:xfrm>
+                            <a:off x="0" y="0"/>
+                            <a:ext cx="2206312" cy="1655159"/>
+                          </a:xfrm>
+                          <a:prstGeom prst="rect">
+                            <a:avLst/>
+                          </a:prstGeom>
+                        </pic:spPr>
+                      </pic:pic>
+                    </a:graphicData>
+                  </a:graphic>
+                </wp:inline>
+              </w:drawing>
+            </w:r>
+          </w:p>
+          <w:p>
+            <w:pPr>
+              <w:tabs>
+                <w:tab w:val="left" w:pos="2450"/>
+                <w:tab w:val="center" w:pos="4252"/>
+              </w:tabs>
+              <w:jc w:val="center"/>
               <w:rPr>
                 <w:rFonts w:ascii="Times New Roman" w:hAnsi="Times New Roman" w:cs="Times New Roman"/>
                 <w:color w:val="000000" w:themeColor="text1"/>
@@ -1918,22 +2686,86 @@
                 <w:tab w:val="left" w:pos="2450"/>
                 <w:tab w:val="center" w:pos="4252"/>
               </w:tabs>
-              <w:spacing w:line="360" w:lineRule="auto"/>
-              <w:rPr>
-                <w:rFonts w:ascii="Times New Roman" w:hAnsi="Times New Roman" w:cs="Times New Roman"/>
-                <w:color w:val="000000" w:themeColor="text1"/>
-                <w:sz w:val="24"/>
-                <w:szCs w:val="24"/>
-              </w:rPr>
-            </w:pPr>
-          </w:p>
-          <w:p>
-            <w:pPr>
-              <w:tabs>
-                <w:tab w:val="left" w:pos="2450"/>
-                <w:tab w:val="center" w:pos="4252"/>
-              </w:tabs>
-              <w:spacing w:line="360" w:lineRule="auto"/>
+              <w:rPr>
+                <w:rFonts w:ascii="Times New Roman" w:hAnsi="Times New Roman" w:cs="Times New Roman"/>
+                <w:color w:val="000000" w:themeColor="text1"/>
+                <w:sz w:val="24"/>
+                <w:szCs w:val="24"/>
+              </w:rPr>
+            </w:pPr>
+          </w:p>
+          <w:p>
+            <w:pPr>
+              <w:tabs>
+                <w:tab w:val="left" w:pos="2450"/>
+                <w:tab w:val="center" w:pos="4252"/>
+              </w:tabs>
+              <w:spacing w:line="360" w:lineRule="auto"/>
+              <w:jc w:val="center"/>
+              <w:rPr>
+                <w:rFonts w:ascii="Times New Roman" w:hAnsi="Times New Roman" w:cs="Times New Roman"/>
+                <w:color w:val="000000" w:themeColor="text1"/>
+                <w:sz w:val="24"/>
+                <w:szCs w:val="24"/>
+              </w:rPr>
+            </w:pPr>
+            <w:r>
+              <w:rPr>
+                <w:rFonts w:ascii="Times New Roman" w:hAnsi="Times New Roman" w:cs="Times New Roman"/>
+                <w:noProof/>
+                <w:color w:val="000000" w:themeColor="text1"/>
+                <w:sz w:val="24"/>
+                <w:szCs w:val="24"/>
+              </w:rPr>
+              <w:drawing>
+                <wp:inline distT="0" distB="0" distL="0" distR="0" wp14:anchorId="34BBD792" wp14:editId="137B5989">
+                  <wp:extent cx="2253232" cy="1688123"/>
+                  <wp:effectExtent l="0" t="0" r="0" b="7620"/>
+                  <wp:docPr id="17" name="Imagem 17"/>
+                  <wp:cNvGraphicFramePr>
+                    <a:graphicFrameLocks xmlns:a="http://schemas.openxmlformats.org/drawingml/2006/main" noChangeAspect="1"/>
+                  </wp:cNvGraphicFramePr>
+                  <a:graphic xmlns:a="http://schemas.openxmlformats.org/drawingml/2006/main">
+                    <a:graphicData uri="http://schemas.openxmlformats.org/drawingml/2006/picture">
+                      <pic:pic xmlns:pic="http://schemas.openxmlformats.org/drawingml/2006/picture">
+                        <pic:nvPicPr>
+                          <pic:cNvPr id="17" name="Imagem 17"/>
+                          <pic:cNvPicPr/>
+                        </pic:nvPicPr>
+                        <pic:blipFill>
+                          <a:blip r:embed="rId20" cstate="print">
+                            <a:extLst>
+                              <a:ext uri="{28A0092B-C50C-407E-A947-70E740481C1C}">
+                                <a14:useLocalDpi xmlns:a14="http://schemas.microsoft.com/office/drawing/2010/main" val="0"/>
+                              </a:ext>
+                            </a:extLst>
+                          </a:blip>
+                          <a:stretch>
+                            <a:fillRect/>
+                          </a:stretch>
+                        </pic:blipFill>
+                        <pic:spPr>
+                          <a:xfrm>
+                            <a:off x="0" y="0"/>
+                            <a:ext cx="2278690" cy="1707196"/>
+                          </a:xfrm>
+                          <a:prstGeom prst="rect">
+                            <a:avLst/>
+                          </a:prstGeom>
+                        </pic:spPr>
+                      </pic:pic>
+                    </a:graphicData>
+                  </a:graphic>
+                </wp:inline>
+              </w:drawing>
+            </w:r>
+          </w:p>
+          <w:p>
+            <w:pPr>
+              <w:tabs>
+                <w:tab w:val="left" w:pos="2450"/>
+                <w:tab w:val="center" w:pos="4252"/>
+              </w:tabs>
               <w:jc w:val="center"/>
               <w:rPr>
                 <w:rFonts w:ascii="Times New Roman" w:hAnsi="Times New Roman" w:cs="Times New Roman"/>
@@ -1975,16 +2807,7 @@
                 <w:sz w:val="16"/>
                 <w:szCs w:val="16"/>
               </w:rPr>
-              <w:t>Impermeabili</w:t>
-            </w:r>
-            <w:r>
-              <w:rPr>
-                <w:rFonts w:ascii="Times New Roman" w:hAnsi="Times New Roman" w:cs="Times New Roman"/>
-                <w:color w:val="000000" w:themeColor="text1"/>
-                <w:sz w:val="16"/>
-                <w:szCs w:val="16"/>
-              </w:rPr>
-              <w:t>zação das Vigas Baldrames e Execução da Alvenaria de Vedação (Guarita)</w:t>
+              <w:t>Execução da Alvenaria de Vedação (Guarita)</w:t>
             </w:r>
           </w:p>
         </w:tc>
@@ -2014,7 +2837,36 @@
                 <w:sz w:val="16"/>
                 <w:szCs w:val="16"/>
               </w:rPr>
-              <w:t xml:space="preserve">Execução dos Pilares, Vigas e Laje </w:t>
+              <w:t xml:space="preserve">Execução </w:t>
+            </w:r>
+            <w:r>
+              <w:rPr>
+                <w:rFonts w:ascii="Times New Roman" w:hAnsi="Times New Roman" w:cs="Times New Roman"/>
+                <w:color w:val="000000" w:themeColor="text1"/>
+                <w:sz w:val="16"/>
+                <w:szCs w:val="16"/>
+              </w:rPr>
+              <w:t xml:space="preserve">das Vegas e </w:t>
+            </w:r>
+            <w:proofErr w:type="spellStart"/>
+            <w:r>
+              <w:rPr>
+                <w:rFonts w:ascii="Times New Roman" w:hAnsi="Times New Roman" w:cs="Times New Roman"/>
+                <w:color w:val="000000" w:themeColor="text1"/>
+                <w:sz w:val="16"/>
+                <w:szCs w:val="16"/>
+              </w:rPr>
+              <w:t>Contravergas</w:t>
+            </w:r>
+            <w:proofErr w:type="spellEnd"/>
+            <w:r>
+              <w:rPr>
+                <w:rFonts w:ascii="Times New Roman" w:hAnsi="Times New Roman" w:cs="Times New Roman"/>
+                <w:color w:val="000000" w:themeColor="text1"/>
+                <w:sz w:val="16"/>
+                <w:szCs w:val="16"/>
+              </w:rPr>
+              <w:t xml:space="preserve"> e Instalações Elétricas </w:t>
             </w:r>
             <w:r>
               <w:rPr>
@@ -2029,6 +2881,902 @@
         </w:tc>
       </w:tr>
     </w:tbl>
+    <w:p>
+      <w:pPr>
+        <w:shd w:val="clear" w:color="auto" w:fill="FFFFFF" w:themeFill="background1"/>
+        <w:tabs>
+          <w:tab w:val="left" w:pos="2450"/>
+          <w:tab w:val="center" w:pos="4252"/>
+        </w:tabs>
+        <w:spacing w:line="360" w:lineRule="auto"/>
+        <w:ind w:right="480"/>
+        <w:rPr>
+          <w:rFonts w:ascii="Times New Roman" w:hAnsi="Times New Roman" w:cs="Times New Roman"/>
+          <w:color w:val="000000" w:themeColor="text1"/>
+          <w:sz w:val="24"/>
+          <w:szCs w:val="24"/>
+        </w:rPr>
+      </w:pPr>
+    </w:p>
+    <w:tbl>
+      <w:tblPr>
+        <w:tblStyle w:val="Tabelacomgrade"/>
+        <w:tblW w:w="8642" w:type="dxa"/>
+        <w:jc w:val="center"/>
+        <w:tblLook w:val="04A0" w:firstRow="1" w:lastRow="0" w:firstColumn="1" w:lastColumn="0" w:noHBand="0" w:noVBand="1"/>
+      </w:tblPr>
+      <w:tblGrid>
+        <w:gridCol w:w="4267"/>
+        <w:gridCol w:w="4375"/>
+      </w:tblGrid>
+      <w:tr>
+        <w:trPr>
+          <w:jc w:val="center"/>
+        </w:trPr>
+        <w:tc>
+          <w:tcPr>
+            <w:tcW w:w="4267" w:type="dxa"/>
+          </w:tcPr>
+          <w:p>
+            <w:pPr>
+              <w:tabs>
+                <w:tab w:val="left" w:pos="2450"/>
+                <w:tab w:val="center" w:pos="4252"/>
+              </w:tabs>
+              <w:spacing w:line="360" w:lineRule="auto"/>
+              <w:jc w:val="center"/>
+              <w:rPr>
+                <w:rFonts w:ascii="Times New Roman" w:hAnsi="Times New Roman" w:cs="Times New Roman"/>
+                <w:color w:val="000000" w:themeColor="text1"/>
+                <w:sz w:val="24"/>
+                <w:szCs w:val="24"/>
+              </w:rPr>
+            </w:pPr>
+            <w:r>
+              <w:rPr>
+                <w:rFonts w:ascii="Times New Roman" w:hAnsi="Times New Roman" w:cs="Times New Roman"/>
+                <w:color w:val="000000" w:themeColor="text1"/>
+                <w:sz w:val="24"/>
+                <w:szCs w:val="24"/>
+              </w:rPr>
+              <w:t>FOTO 1</w:t>
+            </w:r>
+            <w:r>
+              <w:rPr>
+                <w:rFonts w:ascii="Times New Roman" w:hAnsi="Times New Roman" w:cs="Times New Roman"/>
+                <w:color w:val="000000" w:themeColor="text1"/>
+                <w:sz w:val="24"/>
+                <w:szCs w:val="24"/>
+              </w:rPr>
+              <w:t>5</w:t>
+            </w:r>
+          </w:p>
+        </w:tc>
+        <w:tc>
+          <w:tcPr>
+            <w:tcW w:w="4375" w:type="dxa"/>
+          </w:tcPr>
+          <w:p>
+            <w:pPr>
+              <w:tabs>
+                <w:tab w:val="left" w:pos="2450"/>
+                <w:tab w:val="center" w:pos="4252"/>
+              </w:tabs>
+              <w:spacing w:line="360" w:lineRule="auto"/>
+              <w:jc w:val="center"/>
+              <w:rPr>
+                <w:rFonts w:ascii="Times New Roman" w:hAnsi="Times New Roman" w:cs="Times New Roman"/>
+                <w:color w:val="000000" w:themeColor="text1"/>
+                <w:sz w:val="24"/>
+                <w:szCs w:val="24"/>
+              </w:rPr>
+            </w:pPr>
+            <w:r>
+              <w:rPr>
+                <w:rFonts w:ascii="Times New Roman" w:hAnsi="Times New Roman" w:cs="Times New Roman"/>
+                <w:color w:val="000000" w:themeColor="text1"/>
+                <w:sz w:val="24"/>
+                <w:szCs w:val="24"/>
+              </w:rPr>
+              <w:t>FOTO 1</w:t>
+            </w:r>
+            <w:r>
+              <w:rPr>
+                <w:rFonts w:ascii="Times New Roman" w:hAnsi="Times New Roman" w:cs="Times New Roman"/>
+                <w:color w:val="000000" w:themeColor="text1"/>
+                <w:sz w:val="24"/>
+                <w:szCs w:val="24"/>
+              </w:rPr>
+              <w:t>6</w:t>
+            </w:r>
+          </w:p>
+        </w:tc>
+      </w:tr>
+      <w:tr>
+        <w:trPr>
+          <w:jc w:val="center"/>
+        </w:trPr>
+        <w:tc>
+          <w:tcPr>
+            <w:tcW w:w="4267" w:type="dxa"/>
+          </w:tcPr>
+          <w:p>
+            <w:pPr>
+              <w:tabs>
+                <w:tab w:val="left" w:pos="2450"/>
+                <w:tab w:val="center" w:pos="4252"/>
+              </w:tabs>
+              <w:rPr>
+                <w:rFonts w:ascii="Times New Roman" w:hAnsi="Times New Roman" w:cs="Times New Roman"/>
+                <w:color w:val="000000" w:themeColor="text1"/>
+                <w:sz w:val="24"/>
+                <w:szCs w:val="24"/>
+              </w:rPr>
+            </w:pPr>
+          </w:p>
+          <w:p>
+            <w:pPr>
+              <w:tabs>
+                <w:tab w:val="left" w:pos="2450"/>
+                <w:tab w:val="center" w:pos="4252"/>
+              </w:tabs>
+              <w:jc w:val="center"/>
+              <w:rPr>
+                <w:rFonts w:ascii="Times New Roman" w:hAnsi="Times New Roman" w:cs="Times New Roman"/>
+                <w:color w:val="000000" w:themeColor="text1"/>
+                <w:sz w:val="24"/>
+                <w:szCs w:val="24"/>
+              </w:rPr>
+            </w:pPr>
+            <w:r>
+              <w:rPr>
+                <w:rFonts w:ascii="Times New Roman" w:hAnsi="Times New Roman" w:cs="Times New Roman"/>
+                <w:noProof/>
+                <w:color w:val="000000" w:themeColor="text1"/>
+                <w:sz w:val="24"/>
+                <w:szCs w:val="24"/>
+              </w:rPr>
+              <w:drawing>
+                <wp:inline distT="0" distB="0" distL="0" distR="0" wp14:anchorId="32DFE82F" wp14:editId="275B0973">
+                  <wp:extent cx="2369541" cy="1776046"/>
+                  <wp:effectExtent l="0" t="0" r="0" b="0"/>
+                  <wp:docPr id="20" name="Imagem 20"/>
+                  <wp:cNvGraphicFramePr>
+                    <a:graphicFrameLocks xmlns:a="http://schemas.openxmlformats.org/drawingml/2006/main" noChangeAspect="1"/>
+                  </wp:cNvGraphicFramePr>
+                  <a:graphic xmlns:a="http://schemas.openxmlformats.org/drawingml/2006/main">
+                    <a:graphicData uri="http://schemas.openxmlformats.org/drawingml/2006/picture">
+                      <pic:pic xmlns:pic="http://schemas.openxmlformats.org/drawingml/2006/picture">
+                        <pic:nvPicPr>
+                          <pic:cNvPr id="20" name="Imagem 20"/>
+                          <pic:cNvPicPr/>
+                        </pic:nvPicPr>
+                        <pic:blipFill>
+                          <a:blip r:embed="rId21" cstate="print">
+                            <a:extLst>
+                              <a:ext uri="{28A0092B-C50C-407E-A947-70E740481C1C}">
+                                <a14:useLocalDpi xmlns:a14="http://schemas.microsoft.com/office/drawing/2010/main" val="0"/>
+                              </a:ext>
+                            </a:extLst>
+                          </a:blip>
+                          <a:stretch>
+                            <a:fillRect/>
+                          </a:stretch>
+                        </pic:blipFill>
+                        <pic:spPr>
+                          <a:xfrm>
+                            <a:off x="0" y="0"/>
+                            <a:ext cx="2396427" cy="1796198"/>
+                          </a:xfrm>
+                          <a:prstGeom prst="rect">
+                            <a:avLst/>
+                          </a:prstGeom>
+                        </pic:spPr>
+                      </pic:pic>
+                    </a:graphicData>
+                  </a:graphic>
+                </wp:inline>
+              </w:drawing>
+            </w:r>
+          </w:p>
+          <w:p>
+            <w:pPr>
+              <w:tabs>
+                <w:tab w:val="left" w:pos="2450"/>
+                <w:tab w:val="center" w:pos="4252"/>
+              </w:tabs>
+              <w:jc w:val="center"/>
+              <w:rPr>
+                <w:rFonts w:ascii="Times New Roman" w:hAnsi="Times New Roman" w:cs="Times New Roman"/>
+                <w:color w:val="000000" w:themeColor="text1"/>
+                <w:sz w:val="24"/>
+                <w:szCs w:val="24"/>
+              </w:rPr>
+            </w:pPr>
+          </w:p>
+        </w:tc>
+        <w:tc>
+          <w:tcPr>
+            <w:tcW w:w="4375" w:type="dxa"/>
+          </w:tcPr>
+          <w:p>
+            <w:pPr>
+              <w:tabs>
+                <w:tab w:val="left" w:pos="2450"/>
+                <w:tab w:val="center" w:pos="4252"/>
+              </w:tabs>
+              <w:rPr>
+                <w:rFonts w:ascii="Times New Roman" w:hAnsi="Times New Roman" w:cs="Times New Roman"/>
+                <w:color w:val="000000" w:themeColor="text1"/>
+                <w:sz w:val="24"/>
+                <w:szCs w:val="24"/>
+              </w:rPr>
+            </w:pPr>
+          </w:p>
+          <w:p>
+            <w:pPr>
+              <w:tabs>
+                <w:tab w:val="left" w:pos="2450"/>
+                <w:tab w:val="center" w:pos="4252"/>
+              </w:tabs>
+              <w:spacing w:line="360" w:lineRule="auto"/>
+              <w:jc w:val="center"/>
+              <w:rPr>
+                <w:rFonts w:ascii="Times New Roman" w:hAnsi="Times New Roman" w:cs="Times New Roman"/>
+                <w:color w:val="000000" w:themeColor="text1"/>
+                <w:sz w:val="24"/>
+                <w:szCs w:val="24"/>
+              </w:rPr>
+            </w:pPr>
+            <w:r>
+              <w:rPr>
+                <w:rFonts w:ascii="Times New Roman" w:hAnsi="Times New Roman" w:cs="Times New Roman"/>
+                <w:noProof/>
+                <w:color w:val="000000" w:themeColor="text1"/>
+                <w:sz w:val="24"/>
+                <w:szCs w:val="24"/>
+              </w:rPr>
+              <w:drawing>
+                <wp:inline distT="0" distB="0" distL="0" distR="0" wp14:anchorId="4E8B91B0" wp14:editId="56200143">
+                  <wp:extent cx="2380282" cy="1787769"/>
+                  <wp:effectExtent l="0" t="0" r="1270" b="3175"/>
+                  <wp:docPr id="21" name="Imagem 21"/>
+                  <wp:cNvGraphicFramePr>
+                    <a:graphicFrameLocks xmlns:a="http://schemas.openxmlformats.org/drawingml/2006/main" noChangeAspect="1"/>
+                  </wp:cNvGraphicFramePr>
+                  <a:graphic xmlns:a="http://schemas.openxmlformats.org/drawingml/2006/main">
+                    <a:graphicData uri="http://schemas.openxmlformats.org/drawingml/2006/picture">
+                      <pic:pic xmlns:pic="http://schemas.openxmlformats.org/drawingml/2006/picture">
+                        <pic:nvPicPr>
+                          <pic:cNvPr id="21" name="Imagem 21"/>
+                          <pic:cNvPicPr/>
+                        </pic:nvPicPr>
+                        <pic:blipFill>
+                          <a:blip r:embed="rId22" cstate="print">
+                            <a:extLst>
+                              <a:ext uri="{28A0092B-C50C-407E-A947-70E740481C1C}">
+                                <a14:useLocalDpi xmlns:a14="http://schemas.microsoft.com/office/drawing/2010/main" val="0"/>
+                              </a:ext>
+                            </a:extLst>
+                          </a:blip>
+                          <a:stretch>
+                            <a:fillRect/>
+                          </a:stretch>
+                        </pic:blipFill>
+                        <pic:spPr>
+                          <a:xfrm>
+                            <a:off x="0" y="0"/>
+                            <a:ext cx="2405736" cy="1806887"/>
+                          </a:xfrm>
+                          <a:prstGeom prst="rect">
+                            <a:avLst/>
+                          </a:prstGeom>
+                        </pic:spPr>
+                      </pic:pic>
+                    </a:graphicData>
+                  </a:graphic>
+                </wp:inline>
+              </w:drawing>
+            </w:r>
+          </w:p>
+          <w:p>
+            <w:pPr>
+              <w:tabs>
+                <w:tab w:val="left" w:pos="2450"/>
+                <w:tab w:val="center" w:pos="4252"/>
+              </w:tabs>
+              <w:jc w:val="center"/>
+              <w:rPr>
+                <w:rFonts w:ascii="Times New Roman" w:hAnsi="Times New Roman" w:cs="Times New Roman"/>
+                <w:color w:val="000000" w:themeColor="text1"/>
+                <w:sz w:val="24"/>
+                <w:szCs w:val="24"/>
+              </w:rPr>
+            </w:pPr>
+          </w:p>
+        </w:tc>
+      </w:tr>
+      <w:tr>
+        <w:trPr>
+          <w:jc w:val="center"/>
+        </w:trPr>
+        <w:tc>
+          <w:tcPr>
+            <w:tcW w:w="4267" w:type="dxa"/>
+          </w:tcPr>
+          <w:p>
+            <w:pPr>
+              <w:tabs>
+                <w:tab w:val="left" w:pos="2450"/>
+                <w:tab w:val="center" w:pos="4252"/>
+              </w:tabs>
+              <w:spacing w:line="360" w:lineRule="auto"/>
+              <w:jc w:val="center"/>
+              <w:rPr>
+                <w:rFonts w:ascii="Times New Roman" w:hAnsi="Times New Roman" w:cs="Times New Roman"/>
+                <w:color w:val="000000" w:themeColor="text1"/>
+                <w:sz w:val="16"/>
+                <w:szCs w:val="16"/>
+              </w:rPr>
+            </w:pPr>
+            <w:r>
+              <w:rPr>
+                <w:rFonts w:ascii="Times New Roman" w:hAnsi="Times New Roman" w:cs="Times New Roman"/>
+                <w:color w:val="000000" w:themeColor="text1"/>
+                <w:sz w:val="16"/>
+                <w:szCs w:val="16"/>
+              </w:rPr>
+              <w:t xml:space="preserve">Execução </w:t>
+            </w:r>
+            <w:r>
+              <w:rPr>
+                <w:rFonts w:ascii="Times New Roman" w:hAnsi="Times New Roman" w:cs="Times New Roman"/>
+                <w:color w:val="000000" w:themeColor="text1"/>
+                <w:sz w:val="16"/>
+                <w:szCs w:val="16"/>
+              </w:rPr>
+              <w:t>do Contrapiso</w:t>
+            </w:r>
+            <w:r>
+              <w:rPr>
+                <w:rFonts w:ascii="Times New Roman" w:hAnsi="Times New Roman" w:cs="Times New Roman"/>
+                <w:color w:val="000000" w:themeColor="text1"/>
+                <w:sz w:val="16"/>
+                <w:szCs w:val="16"/>
+              </w:rPr>
+              <w:t xml:space="preserve"> (Guarita)</w:t>
+            </w:r>
+          </w:p>
+        </w:tc>
+        <w:tc>
+          <w:tcPr>
+            <w:tcW w:w="4375" w:type="dxa"/>
+          </w:tcPr>
+          <w:p>
+            <w:pPr>
+              <w:tabs>
+                <w:tab w:val="left" w:pos="2450"/>
+                <w:tab w:val="center" w:pos="4252"/>
+              </w:tabs>
+              <w:spacing w:line="360" w:lineRule="auto"/>
+              <w:jc w:val="center"/>
+              <w:rPr>
+                <w:rFonts w:ascii="Times New Roman" w:hAnsi="Times New Roman" w:cs="Times New Roman"/>
+                <w:color w:val="000000" w:themeColor="text1"/>
+                <w:sz w:val="16"/>
+                <w:szCs w:val="16"/>
+              </w:rPr>
+            </w:pPr>
+            <w:r>
+              <w:rPr>
+                <w:rFonts w:ascii="Times New Roman" w:hAnsi="Times New Roman" w:cs="Times New Roman"/>
+                <w:color w:val="000000" w:themeColor="text1"/>
+                <w:sz w:val="16"/>
+                <w:szCs w:val="16"/>
+              </w:rPr>
+              <w:t>Execução da</w:t>
+            </w:r>
+            <w:r>
+              <w:rPr>
+                <w:rFonts w:ascii="Times New Roman" w:hAnsi="Times New Roman" w:cs="Times New Roman"/>
+                <w:color w:val="000000" w:themeColor="text1"/>
+                <w:sz w:val="16"/>
+                <w:szCs w:val="16"/>
+              </w:rPr>
+              <w:t xml:space="preserve">s Instalações Sanitárias </w:t>
+            </w:r>
+          </w:p>
+        </w:tc>
+      </w:tr>
+    </w:tbl>
+    <w:p>
+      <w:pPr>
+        <w:shd w:val="clear" w:color="auto" w:fill="FFFFFF" w:themeFill="background1"/>
+        <w:tabs>
+          <w:tab w:val="left" w:pos="2450"/>
+          <w:tab w:val="center" w:pos="4252"/>
+        </w:tabs>
+        <w:spacing w:line="360" w:lineRule="auto"/>
+        <w:ind w:right="480"/>
+        <w:rPr>
+          <w:rFonts w:ascii="Times New Roman" w:hAnsi="Times New Roman" w:cs="Times New Roman"/>
+          <w:color w:val="000000" w:themeColor="text1"/>
+          <w:sz w:val="24"/>
+          <w:szCs w:val="24"/>
+        </w:rPr>
+      </w:pPr>
+    </w:p>
+    <w:p>
+      <w:pPr>
+        <w:shd w:val="clear" w:color="auto" w:fill="FFFFFF" w:themeFill="background1"/>
+        <w:tabs>
+          <w:tab w:val="left" w:pos="2450"/>
+          <w:tab w:val="center" w:pos="4252"/>
+        </w:tabs>
+        <w:spacing w:line="360" w:lineRule="auto"/>
+        <w:ind w:right="480"/>
+        <w:rPr>
+          <w:rFonts w:ascii="Times New Roman" w:hAnsi="Times New Roman" w:cs="Times New Roman"/>
+          <w:color w:val="000000" w:themeColor="text1"/>
+          <w:sz w:val="24"/>
+          <w:szCs w:val="24"/>
+        </w:rPr>
+      </w:pPr>
+    </w:p>
+    <w:p>
+      <w:pPr>
+        <w:shd w:val="clear" w:color="auto" w:fill="FFFFFF" w:themeFill="background1"/>
+        <w:tabs>
+          <w:tab w:val="left" w:pos="2450"/>
+          <w:tab w:val="center" w:pos="4252"/>
+        </w:tabs>
+        <w:spacing w:line="360" w:lineRule="auto"/>
+        <w:ind w:right="480"/>
+        <w:rPr>
+          <w:rFonts w:ascii="Times New Roman" w:hAnsi="Times New Roman" w:cs="Times New Roman"/>
+          <w:color w:val="000000" w:themeColor="text1"/>
+          <w:sz w:val="24"/>
+          <w:szCs w:val="24"/>
+        </w:rPr>
+      </w:pPr>
+    </w:p>
+    <w:tbl>
+      <w:tblPr>
+        <w:tblStyle w:val="Tabelacomgrade"/>
+        <w:tblW w:w="8642" w:type="dxa"/>
+        <w:jc w:val="center"/>
+        <w:tblLook w:val="04A0" w:firstRow="1" w:lastRow="0" w:firstColumn="1" w:lastColumn="0" w:noHBand="0" w:noVBand="1"/>
+      </w:tblPr>
+      <w:tblGrid>
+        <w:gridCol w:w="4267"/>
+        <w:gridCol w:w="4375"/>
+      </w:tblGrid>
+      <w:tr>
+        <w:trPr>
+          <w:jc w:val="center"/>
+        </w:trPr>
+        <w:tc>
+          <w:tcPr>
+            <w:tcW w:w="4267" w:type="dxa"/>
+          </w:tcPr>
+          <w:p>
+            <w:pPr>
+              <w:tabs>
+                <w:tab w:val="left" w:pos="2450"/>
+                <w:tab w:val="center" w:pos="4252"/>
+              </w:tabs>
+              <w:spacing w:line="360" w:lineRule="auto"/>
+              <w:jc w:val="center"/>
+              <w:rPr>
+                <w:rFonts w:ascii="Times New Roman" w:hAnsi="Times New Roman" w:cs="Times New Roman"/>
+                <w:color w:val="000000" w:themeColor="text1"/>
+                <w:sz w:val="24"/>
+                <w:szCs w:val="24"/>
+              </w:rPr>
+            </w:pPr>
+            <w:r>
+              <w:rPr>
+                <w:rFonts w:ascii="Times New Roman" w:hAnsi="Times New Roman" w:cs="Times New Roman"/>
+                <w:color w:val="000000" w:themeColor="text1"/>
+                <w:sz w:val="24"/>
+                <w:szCs w:val="24"/>
+              </w:rPr>
+              <w:lastRenderedPageBreak/>
+              <w:t>FOTO 1</w:t>
+            </w:r>
+            <w:r>
+              <w:rPr>
+                <w:rFonts w:ascii="Times New Roman" w:hAnsi="Times New Roman" w:cs="Times New Roman"/>
+                <w:color w:val="000000" w:themeColor="text1"/>
+                <w:sz w:val="24"/>
+                <w:szCs w:val="24"/>
+              </w:rPr>
+              <w:t>7</w:t>
+            </w:r>
+          </w:p>
+        </w:tc>
+        <w:tc>
+          <w:tcPr>
+            <w:tcW w:w="4375" w:type="dxa"/>
+          </w:tcPr>
+          <w:p>
+            <w:pPr>
+              <w:tabs>
+                <w:tab w:val="left" w:pos="2450"/>
+                <w:tab w:val="center" w:pos="4252"/>
+              </w:tabs>
+              <w:spacing w:line="360" w:lineRule="auto"/>
+              <w:jc w:val="center"/>
+              <w:rPr>
+                <w:rFonts w:ascii="Times New Roman" w:hAnsi="Times New Roman" w:cs="Times New Roman"/>
+                <w:color w:val="000000" w:themeColor="text1"/>
+                <w:sz w:val="24"/>
+                <w:szCs w:val="24"/>
+              </w:rPr>
+            </w:pPr>
+            <w:r>
+              <w:rPr>
+                <w:rFonts w:ascii="Times New Roman" w:hAnsi="Times New Roman" w:cs="Times New Roman"/>
+                <w:color w:val="000000" w:themeColor="text1"/>
+                <w:sz w:val="24"/>
+                <w:szCs w:val="24"/>
+              </w:rPr>
+              <w:t>FOTO 1</w:t>
+            </w:r>
+            <w:r>
+              <w:rPr>
+                <w:rFonts w:ascii="Times New Roman" w:hAnsi="Times New Roman" w:cs="Times New Roman"/>
+                <w:color w:val="000000" w:themeColor="text1"/>
+                <w:sz w:val="24"/>
+                <w:szCs w:val="24"/>
+              </w:rPr>
+              <w:t>8</w:t>
+            </w:r>
+          </w:p>
+        </w:tc>
+      </w:tr>
+      <w:tr>
+        <w:trPr>
+          <w:jc w:val="center"/>
+        </w:trPr>
+        <w:tc>
+          <w:tcPr>
+            <w:tcW w:w="4267" w:type="dxa"/>
+          </w:tcPr>
+          <w:p>
+            <w:pPr>
+              <w:tabs>
+                <w:tab w:val="left" w:pos="2450"/>
+                <w:tab w:val="center" w:pos="4252"/>
+              </w:tabs>
+              <w:rPr>
+                <w:rFonts w:ascii="Times New Roman" w:hAnsi="Times New Roman" w:cs="Times New Roman"/>
+                <w:noProof/>
+                <w:color w:val="000000" w:themeColor="text1"/>
+                <w:sz w:val="24"/>
+                <w:szCs w:val="24"/>
+              </w:rPr>
+            </w:pPr>
+          </w:p>
+          <w:p>
+            <w:pPr>
+              <w:tabs>
+                <w:tab w:val="left" w:pos="2450"/>
+                <w:tab w:val="center" w:pos="4252"/>
+              </w:tabs>
+              <w:jc w:val="center"/>
+              <w:rPr>
+                <w:rFonts w:ascii="Times New Roman" w:hAnsi="Times New Roman" w:cs="Times New Roman"/>
+                <w:color w:val="000000" w:themeColor="text1"/>
+                <w:sz w:val="24"/>
+                <w:szCs w:val="24"/>
+              </w:rPr>
+            </w:pPr>
+            <w:r>
+              <w:rPr>
+                <w:rFonts w:ascii="Times New Roman" w:hAnsi="Times New Roman" w:cs="Times New Roman"/>
+                <w:noProof/>
+                <w:color w:val="000000" w:themeColor="text1"/>
+                <w:sz w:val="24"/>
+                <w:szCs w:val="24"/>
+              </w:rPr>
+              <w:drawing>
+                <wp:inline distT="0" distB="0" distL="0" distR="0" wp14:anchorId="5B137397" wp14:editId="7B855994">
+                  <wp:extent cx="2278185" cy="1708575"/>
+                  <wp:effectExtent l="0" t="0" r="8255" b="6350"/>
+                  <wp:docPr id="23" name="Imagem 23"/>
+                  <wp:cNvGraphicFramePr>
+                    <a:graphicFrameLocks xmlns:a="http://schemas.openxmlformats.org/drawingml/2006/main" noChangeAspect="1"/>
+                  </wp:cNvGraphicFramePr>
+                  <a:graphic xmlns:a="http://schemas.openxmlformats.org/drawingml/2006/main">
+                    <a:graphicData uri="http://schemas.openxmlformats.org/drawingml/2006/picture">
+                      <pic:pic xmlns:pic="http://schemas.openxmlformats.org/drawingml/2006/picture">
+                        <pic:nvPicPr>
+                          <pic:cNvPr id="23" name="Imagem 23"/>
+                          <pic:cNvPicPr/>
+                        </pic:nvPicPr>
+                        <pic:blipFill>
+                          <a:blip r:embed="rId23" cstate="print">
+                            <a:extLst>
+                              <a:ext uri="{28A0092B-C50C-407E-A947-70E740481C1C}">
+                                <a14:useLocalDpi xmlns:a14="http://schemas.microsoft.com/office/drawing/2010/main" val="0"/>
+                              </a:ext>
+                            </a:extLst>
+                          </a:blip>
+                          <a:stretch>
+                            <a:fillRect/>
+                          </a:stretch>
+                        </pic:blipFill>
+                        <pic:spPr>
+                          <a:xfrm>
+                            <a:off x="0" y="0"/>
+                            <a:ext cx="2291980" cy="1718921"/>
+                          </a:xfrm>
+                          <a:prstGeom prst="rect">
+                            <a:avLst/>
+                          </a:prstGeom>
+                        </pic:spPr>
+                      </pic:pic>
+                    </a:graphicData>
+                  </a:graphic>
+                </wp:inline>
+              </w:drawing>
+            </w:r>
+          </w:p>
+          <w:p>
+            <w:pPr>
+              <w:tabs>
+                <w:tab w:val="left" w:pos="2450"/>
+                <w:tab w:val="center" w:pos="4252"/>
+              </w:tabs>
+              <w:jc w:val="center"/>
+              <w:rPr>
+                <w:rFonts w:ascii="Times New Roman" w:hAnsi="Times New Roman" w:cs="Times New Roman"/>
+                <w:color w:val="000000" w:themeColor="text1"/>
+                <w:sz w:val="24"/>
+                <w:szCs w:val="24"/>
+              </w:rPr>
+            </w:pPr>
+          </w:p>
+        </w:tc>
+        <w:tc>
+          <w:tcPr>
+            <w:tcW w:w="4375" w:type="dxa"/>
+          </w:tcPr>
+          <w:p>
+            <w:pPr>
+              <w:tabs>
+                <w:tab w:val="left" w:pos="2450"/>
+                <w:tab w:val="center" w:pos="4252"/>
+              </w:tabs>
+              <w:rPr>
+                <w:rFonts w:ascii="Times New Roman" w:hAnsi="Times New Roman" w:cs="Times New Roman"/>
+                <w:color w:val="000000" w:themeColor="text1"/>
+                <w:sz w:val="24"/>
+                <w:szCs w:val="24"/>
+              </w:rPr>
+            </w:pPr>
+          </w:p>
+          <w:p>
+            <w:pPr>
+              <w:tabs>
+                <w:tab w:val="left" w:pos="2450"/>
+                <w:tab w:val="center" w:pos="4252"/>
+              </w:tabs>
+              <w:spacing w:line="360" w:lineRule="auto"/>
+              <w:jc w:val="center"/>
+              <w:rPr>
+                <w:rFonts w:ascii="Times New Roman" w:hAnsi="Times New Roman" w:cs="Times New Roman"/>
+                <w:color w:val="000000" w:themeColor="text1"/>
+                <w:sz w:val="24"/>
+                <w:szCs w:val="24"/>
+              </w:rPr>
+            </w:pPr>
+            <w:r>
+              <w:rPr>
+                <w:rFonts w:ascii="Times New Roman" w:hAnsi="Times New Roman" w:cs="Times New Roman"/>
+                <w:noProof/>
+                <w:color w:val="000000" w:themeColor="text1"/>
+                <w:sz w:val="24"/>
+                <w:szCs w:val="24"/>
+              </w:rPr>
+              <w:drawing>
+                <wp:inline distT="0" distB="0" distL="0" distR="0" wp14:anchorId="3E922605" wp14:editId="6059B923">
+                  <wp:extent cx="2289295" cy="1705552"/>
+                  <wp:effectExtent l="0" t="0" r="0" b="9525"/>
+                  <wp:docPr id="24" name="Imagem 24"/>
+                  <wp:cNvGraphicFramePr>
+                    <a:graphicFrameLocks xmlns:a="http://schemas.openxmlformats.org/drawingml/2006/main" noChangeAspect="1"/>
+                  </wp:cNvGraphicFramePr>
+                  <a:graphic xmlns:a="http://schemas.openxmlformats.org/drawingml/2006/main">
+                    <a:graphicData uri="http://schemas.openxmlformats.org/drawingml/2006/picture">
+                      <pic:pic xmlns:pic="http://schemas.openxmlformats.org/drawingml/2006/picture">
+                        <pic:nvPicPr>
+                          <pic:cNvPr id="24" name="Imagem 24"/>
+                          <pic:cNvPicPr/>
+                        </pic:nvPicPr>
+                        <pic:blipFill>
+                          <a:blip r:embed="rId24" cstate="print">
+                            <a:extLst>
+                              <a:ext uri="{28A0092B-C50C-407E-A947-70E740481C1C}">
+                                <a14:useLocalDpi xmlns:a14="http://schemas.microsoft.com/office/drawing/2010/main" val="0"/>
+                              </a:ext>
+                            </a:extLst>
+                          </a:blip>
+                          <a:stretch>
+                            <a:fillRect/>
+                          </a:stretch>
+                        </pic:blipFill>
+                        <pic:spPr>
+                          <a:xfrm>
+                            <a:off x="0" y="0"/>
+                            <a:ext cx="2319403" cy="1727983"/>
+                          </a:xfrm>
+                          <a:prstGeom prst="rect">
+                            <a:avLst/>
+                          </a:prstGeom>
+                        </pic:spPr>
+                      </pic:pic>
+                    </a:graphicData>
+                  </a:graphic>
+                </wp:inline>
+              </w:drawing>
+            </w:r>
+          </w:p>
+          <w:p>
+            <w:pPr>
+              <w:tabs>
+                <w:tab w:val="left" w:pos="2450"/>
+                <w:tab w:val="center" w:pos="4252"/>
+              </w:tabs>
+              <w:jc w:val="center"/>
+              <w:rPr>
+                <w:rFonts w:ascii="Times New Roman" w:hAnsi="Times New Roman" w:cs="Times New Roman"/>
+                <w:color w:val="000000" w:themeColor="text1"/>
+                <w:sz w:val="24"/>
+                <w:szCs w:val="24"/>
+              </w:rPr>
+            </w:pPr>
+          </w:p>
+        </w:tc>
+      </w:tr>
+      <w:tr>
+        <w:trPr>
+          <w:jc w:val="center"/>
+        </w:trPr>
+        <w:tc>
+          <w:tcPr>
+            <w:tcW w:w="4267" w:type="dxa"/>
+          </w:tcPr>
+          <w:p>
+            <w:pPr>
+              <w:tabs>
+                <w:tab w:val="left" w:pos="2450"/>
+                <w:tab w:val="center" w:pos="4252"/>
+              </w:tabs>
+              <w:spacing w:line="360" w:lineRule="auto"/>
+              <w:jc w:val="center"/>
+              <w:rPr>
+                <w:rFonts w:ascii="Times New Roman" w:hAnsi="Times New Roman" w:cs="Times New Roman"/>
+                <w:color w:val="000000" w:themeColor="text1"/>
+                <w:sz w:val="16"/>
+                <w:szCs w:val="16"/>
+              </w:rPr>
+            </w:pPr>
+            <w:r>
+              <w:rPr>
+                <w:rFonts w:ascii="Times New Roman" w:hAnsi="Times New Roman" w:cs="Times New Roman"/>
+                <w:color w:val="000000" w:themeColor="text1"/>
+                <w:sz w:val="16"/>
+                <w:szCs w:val="16"/>
+              </w:rPr>
+              <w:t>Execução da Alvenaria (</w:t>
+            </w:r>
+            <w:r>
+              <w:rPr>
+                <w:rFonts w:ascii="Times New Roman" w:hAnsi="Times New Roman" w:cs="Times New Roman"/>
+                <w:color w:val="000000" w:themeColor="text1"/>
+                <w:sz w:val="16"/>
+                <w:szCs w:val="16"/>
+              </w:rPr>
+              <w:t>Bancos</w:t>
+            </w:r>
+            <w:r>
+              <w:rPr>
+                <w:rFonts w:ascii="Times New Roman" w:hAnsi="Times New Roman" w:cs="Times New Roman"/>
+                <w:color w:val="000000" w:themeColor="text1"/>
+                <w:sz w:val="16"/>
+                <w:szCs w:val="16"/>
+              </w:rPr>
+              <w:t>)</w:t>
+            </w:r>
+          </w:p>
+        </w:tc>
+        <w:tc>
+          <w:tcPr>
+            <w:tcW w:w="4375" w:type="dxa"/>
+          </w:tcPr>
+          <w:p>
+            <w:pPr>
+              <w:tabs>
+                <w:tab w:val="left" w:pos="2450"/>
+                <w:tab w:val="center" w:pos="4252"/>
+              </w:tabs>
+              <w:spacing w:line="360" w:lineRule="auto"/>
+              <w:jc w:val="center"/>
+              <w:rPr>
+                <w:rFonts w:ascii="Times New Roman" w:hAnsi="Times New Roman" w:cs="Times New Roman"/>
+                <w:color w:val="000000" w:themeColor="text1"/>
+                <w:sz w:val="16"/>
+                <w:szCs w:val="16"/>
+              </w:rPr>
+            </w:pPr>
+            <w:r>
+              <w:rPr>
+                <w:rFonts w:ascii="Times New Roman" w:hAnsi="Times New Roman" w:cs="Times New Roman"/>
+                <w:color w:val="000000" w:themeColor="text1"/>
+                <w:sz w:val="16"/>
+                <w:szCs w:val="16"/>
+              </w:rPr>
+              <w:t>Execução d</w:t>
+            </w:r>
+            <w:r>
+              <w:rPr>
+                <w:rFonts w:ascii="Times New Roman" w:hAnsi="Times New Roman" w:cs="Times New Roman"/>
+                <w:color w:val="000000" w:themeColor="text1"/>
+                <w:sz w:val="16"/>
+                <w:szCs w:val="16"/>
+              </w:rPr>
+              <w:t xml:space="preserve">as Instalações Elétricas </w:t>
+            </w:r>
+            <w:r>
+              <w:rPr>
+                <w:rFonts w:ascii="Times New Roman" w:hAnsi="Times New Roman" w:cs="Times New Roman"/>
+                <w:color w:val="000000" w:themeColor="text1"/>
+                <w:sz w:val="16"/>
+                <w:szCs w:val="16"/>
+              </w:rPr>
+              <w:t>(</w:t>
+            </w:r>
+            <w:r>
+              <w:rPr>
+                <w:rFonts w:ascii="Times New Roman" w:hAnsi="Times New Roman" w:cs="Times New Roman"/>
+                <w:color w:val="000000" w:themeColor="text1"/>
+                <w:sz w:val="16"/>
+                <w:szCs w:val="16"/>
+              </w:rPr>
+              <w:t>Externa</w:t>
+            </w:r>
+            <w:r>
+              <w:rPr>
+                <w:rFonts w:ascii="Times New Roman" w:hAnsi="Times New Roman" w:cs="Times New Roman"/>
+                <w:color w:val="000000" w:themeColor="text1"/>
+                <w:sz w:val="16"/>
+                <w:szCs w:val="16"/>
+              </w:rPr>
+              <w:t>)</w:t>
+            </w:r>
+          </w:p>
+        </w:tc>
+      </w:tr>
+    </w:tbl>
+    <w:p>
+      <w:pPr>
+        <w:shd w:val="clear" w:color="auto" w:fill="FFFFFF" w:themeFill="background1"/>
+        <w:tabs>
+          <w:tab w:val="left" w:pos="2450"/>
+          <w:tab w:val="center" w:pos="4252"/>
+        </w:tabs>
+        <w:spacing w:line="360" w:lineRule="auto"/>
+        <w:ind w:right="480"/>
+        <w:rPr>
+          <w:rFonts w:ascii="Times New Roman" w:hAnsi="Times New Roman" w:cs="Times New Roman"/>
+          <w:color w:val="000000" w:themeColor="text1"/>
+          <w:sz w:val="24"/>
+          <w:szCs w:val="24"/>
+        </w:rPr>
+      </w:pPr>
+    </w:p>
     <w:p>
       <w:pPr>
         <w:shd w:val="clear" w:color="auto" w:fill="FFFFFF" w:themeFill="background1"/>
@@ -2070,7 +3818,6 @@
           <w:sz w:val="20"/>
           <w:szCs w:val="20"/>
         </w:rPr>
-        <w:lastRenderedPageBreak/>
         <w:t xml:space="preserve">Coremas-PB, </w:t>
       </w:r>
       <w:r>
@@ -2089,7 +3836,7 @@
           <w:sz w:val="20"/>
           <w:szCs w:val="20"/>
         </w:rPr>
-        <w:t>8</w:t>
+        <w:t>7</w:t>
       </w:r>
       <w:r>
         <w:rPr>
@@ -2419,8 +4166,8 @@
       </w:pPr>
     </w:p>
     <w:sectPr>
-      <w:headerReference w:type="default" r:id="rId7"/>
-      <w:footerReference w:type="default" r:id="rId8"/>
+      <w:headerReference w:type="default" r:id="rId25"/>
+      <w:footerReference w:type="default" r:id="rId26"/>
       <w:pgSz w:w="11906" w:h="16838" w:code="9"/>
       <w:pgMar w:top="1701" w:right="1134" w:bottom="1134" w:left="1701" w:header="284" w:footer="284" w:gutter="0"/>
       <w:cols w:space="708"/>
@@ -3237,7 +4984,7 @@
   <w:style w:type="paragraph" w:default="1" w:styleId="Normal">
     <w:name w:val="Normal"/>
     <w:qFormat/>
-    <w:rsid w:val="00A1044A"/>
+    <w:rsid w:val="00695C23"/>
   </w:style>
   <w:style w:type="paragraph" w:styleId="Ttulo7">
     <w:name w:val="heading 7"/>

</xml_diff>